<commit_message>
se añader nuevo DU y material.zip
</commit_message>
<xml_diff>
--- a/fuentes/123101_CF07_DU.docx
+++ b/fuentes/123101_CF07_DU.docx
@@ -12,7 +12,7 @@
           <w:lang w:eastAsia="es-CO"/>
         </w:rPr>
         <w:drawing>
-          <wp:anchor distT="0" distB="0" distL="114300" distR="114300" simplePos="0" relativeHeight="251659264" behindDoc="1" locked="0" layoutInCell="1" allowOverlap="1" wp14:anchorId="6A55977C" wp14:editId="55D9AAF7">
+          <wp:anchor distT="0" distB="0" distL="114300" distR="114300" simplePos="0" relativeHeight="251659264" behindDoc="1" locked="0" layoutInCell="1" allowOverlap="1" wp14:anchorId="6A55977C" wp14:editId="039D96D6">
             <wp:simplePos x="0" y="0"/>
             <wp:positionH relativeFrom="column">
               <wp:posOffset>-749106</wp:posOffset>
@@ -124,7 +124,7 @@
         <mc:AlternateContent>
           <mc:Choice Requires="wps">
             <w:drawing>
-              <wp:anchor distT="0" distB="0" distL="114300" distR="114300" simplePos="0" relativeHeight="251661312" behindDoc="1" locked="0" layoutInCell="1" allowOverlap="1" wp14:anchorId="0853532D" wp14:editId="0E905E38">
+              <wp:anchor distT="0" distB="0" distL="114300" distR="114300" simplePos="0" relativeHeight="251661312" behindDoc="1" locked="0" layoutInCell="1" allowOverlap="1" wp14:anchorId="0853532D" wp14:editId="530DF7A4">
                 <wp:simplePos x="0" y="0"/>
                 <wp:positionH relativeFrom="column">
                   <wp:posOffset>-710565</wp:posOffset>
@@ -195,7 +195,7 @@
           </mc:Choice>
           <mc:Fallback>
             <w:pict>
-              <v:rect w14:anchorId="458BC005" id="Rectángulo 3" o:spid="_x0000_s1026" style="position:absolute;margin-left:-55.95pt;margin-top:19.55pt;width:613.85pt;height:164.25pt;z-index:-251655168;visibility:visible;mso-wrap-style:square;mso-height-percent:0;mso-wrap-distance-left:9pt;mso-wrap-distance-top:0;mso-wrap-distance-right:9pt;mso-wrap-distance-bottom:0;mso-position-horizontal:absolute;mso-position-horizontal-relative:text;mso-position-vertical:absolute;mso-position-vertical-relative:text;mso-height-percent:0;mso-height-relative:margin;v-text-anchor:middle" o:gfxdata="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" fillcolor="#00314d" stroked="f" strokeweight="1pt"/>
+              <v:rect w14:anchorId="196CE425" id="Rectángulo 3" o:spid="_x0000_s1026" style="position:absolute;margin-left:-55.95pt;margin-top:19.55pt;width:613.85pt;height:164.25pt;z-index:-251655168;visibility:visible;mso-wrap-style:square;mso-height-percent:0;mso-wrap-distance-left:9pt;mso-wrap-distance-top:0;mso-wrap-distance-right:9pt;mso-wrap-distance-bottom:0;mso-position-horizontal:absolute;mso-position-horizontal-relative:text;mso-position-vertical:absolute;mso-position-vertical-relative:text;mso-height-percent:0;mso-height-relative:margin;v-text-anchor:middle" o:gfxdata="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" fillcolor="#00314d" stroked="f" strokeweight="1pt"/>
             </w:pict>
           </mc:Fallback>
         </mc:AlternateContent>
@@ -519,7 +519,7 @@
           <w:r>
             <w:fldChar w:fldCharType="separate"/>
           </w:r>
-          <w:hyperlink w:anchor="_Toc197526670" w:history="1">
+          <w:hyperlink w:anchor="_Toc197627333" w:history="1">
             <w:r>
               <w:rPr>
                 <w:rStyle w:val="Hipervnculo"/>
@@ -546,7 +546,7 @@
                 <w:noProof/>
                 <w:webHidden/>
               </w:rPr>
-              <w:instrText xml:space="preserve"> PAGEREF _Toc197526670 \h </w:instrText>
+              <w:instrText xml:space="preserve"> PAGEREF _Toc197627333 \h </w:instrText>
             </w:r>
             <w:r>
               <w:rPr>
@@ -592,7 +592,7 @@
               <w:lang w:eastAsia="es-CO"/>
             </w:rPr>
           </w:pPr>
-          <w:hyperlink w:anchor="_Toc197526671" w:history="1">
+          <w:hyperlink w:anchor="_Toc197627334" w:history="1">
             <w:r>
               <w:rPr>
                 <w:rStyle w:val="Hipervnculo"/>
@@ -636,7 +636,7 @@
                 <w:noProof/>
                 <w:webHidden/>
               </w:rPr>
-              <w:instrText xml:space="preserve"> PAGEREF _Toc197526671 \h </w:instrText>
+              <w:instrText xml:space="preserve"> PAGEREF _Toc197627334 \h </w:instrText>
             </w:r>
             <w:r>
               <w:rPr>
@@ -682,7 +682,7 @@
               <w:lang w:eastAsia="es-CO"/>
             </w:rPr>
           </w:pPr>
-          <w:hyperlink w:anchor="_Toc197526672" w:history="1">
+          <w:hyperlink w:anchor="_Toc197627335" w:history="1">
             <w:r>
               <w:rPr>
                 <w:rStyle w:val="Hipervnculo"/>
@@ -732,7 +732,7 @@
                 <w:noProof/>
                 <w:webHidden/>
               </w:rPr>
-              <w:instrText xml:space="preserve"> PAGEREF _Toc197526672 \h </w:instrText>
+              <w:instrText xml:space="preserve"> PAGEREF _Toc197627335 \h </w:instrText>
             </w:r>
             <w:r>
               <w:rPr>
@@ -778,7 +778,7 @@
               <w:lang w:eastAsia="es-CO"/>
             </w:rPr>
           </w:pPr>
-          <w:hyperlink w:anchor="_Toc197526673" w:history="1">
+          <w:hyperlink w:anchor="_Toc197627336" w:history="1">
             <w:r>
               <w:rPr>
                 <w:rStyle w:val="Hipervnculo"/>
@@ -828,7 +828,7 @@
                 <w:noProof/>
                 <w:webHidden/>
               </w:rPr>
-              <w:instrText xml:space="preserve"> PAGEREF _Toc197526673 \h </w:instrText>
+              <w:instrText xml:space="preserve"> PAGEREF _Toc197627336 \h </w:instrText>
             </w:r>
             <w:r>
               <w:rPr>
@@ -874,7 +874,7 @@
               <w:lang w:eastAsia="es-CO"/>
             </w:rPr>
           </w:pPr>
-          <w:hyperlink w:anchor="_Toc197526674" w:history="1">
+          <w:hyperlink w:anchor="_Toc197627337" w:history="1">
             <w:r>
               <w:rPr>
                 <w:rStyle w:val="Hipervnculo"/>
@@ -924,7 +924,7 @@
                 <w:noProof/>
                 <w:webHidden/>
               </w:rPr>
-              <w:instrText xml:space="preserve"> PAGEREF _Toc197526674 \h </w:instrText>
+              <w:instrText xml:space="preserve"> PAGEREF _Toc197627337 \h </w:instrText>
             </w:r>
             <w:r>
               <w:rPr>
@@ -970,7 +970,7 @@
               <w:lang w:eastAsia="es-CO"/>
             </w:rPr>
           </w:pPr>
-          <w:hyperlink w:anchor="_Toc197526675" w:history="1">
+          <w:hyperlink w:anchor="_Toc197627338" w:history="1">
             <w:r>
               <w:rPr>
                 <w:rStyle w:val="Hipervnculo"/>
@@ -1020,7 +1020,7 @@
                 <w:noProof/>
                 <w:webHidden/>
               </w:rPr>
-              <w:instrText xml:space="preserve"> PAGEREF _Toc197526675 \h </w:instrText>
+              <w:instrText xml:space="preserve"> PAGEREF _Toc197627338 \h </w:instrText>
             </w:r>
             <w:r>
               <w:rPr>
@@ -1066,7 +1066,7 @@
               <w:lang w:eastAsia="es-CO"/>
             </w:rPr>
           </w:pPr>
-          <w:hyperlink w:anchor="_Toc197526676" w:history="1">
+          <w:hyperlink w:anchor="_Toc197627339" w:history="1">
             <w:r>
               <w:rPr>
                 <w:rStyle w:val="Hipervnculo"/>
@@ -1116,7 +1116,7 @@
                 <w:noProof/>
                 <w:webHidden/>
               </w:rPr>
-              <w:instrText xml:space="preserve"> PAGEREF _Toc197526676 \h </w:instrText>
+              <w:instrText xml:space="preserve"> PAGEREF _Toc197627339 \h </w:instrText>
             </w:r>
             <w:r>
               <w:rPr>
@@ -1162,7 +1162,7 @@
               <w:lang w:eastAsia="es-CO"/>
             </w:rPr>
           </w:pPr>
-          <w:hyperlink w:anchor="_Toc197526677" w:history="1">
+          <w:hyperlink w:anchor="_Toc197627340" w:history="1">
             <w:r>
               <w:rPr>
                 <w:rStyle w:val="Hipervnculo"/>
@@ -1212,7 +1212,7 @@
                 <w:noProof/>
                 <w:webHidden/>
               </w:rPr>
-              <w:instrText xml:space="preserve"> PAGEREF _Toc197526677 \h </w:instrText>
+              <w:instrText xml:space="preserve"> PAGEREF _Toc197627340 \h </w:instrText>
             </w:r>
             <w:r>
               <w:rPr>
@@ -1258,7 +1258,7 @@
               <w:lang w:eastAsia="es-CO"/>
             </w:rPr>
           </w:pPr>
-          <w:hyperlink w:anchor="_Toc197526678" w:history="1">
+          <w:hyperlink w:anchor="_Toc197627341" w:history="1">
             <w:r>
               <w:rPr>
                 <w:rStyle w:val="Hipervnculo"/>
@@ -1308,7 +1308,7 @@
                 <w:noProof/>
                 <w:webHidden/>
               </w:rPr>
-              <w:instrText xml:space="preserve"> PAGEREF _Toc197526678 \h </w:instrText>
+              <w:instrText xml:space="preserve"> PAGEREF _Toc197627341 \h </w:instrText>
             </w:r>
             <w:r>
               <w:rPr>
@@ -1354,7 +1354,7 @@
               <w:lang w:eastAsia="es-CO"/>
             </w:rPr>
           </w:pPr>
-          <w:hyperlink w:anchor="_Toc197526679" w:history="1">
+          <w:hyperlink w:anchor="_Toc197627342" w:history="1">
             <w:r>
               <w:rPr>
                 <w:rStyle w:val="Hipervnculo"/>
@@ -1398,7 +1398,7 @@
                 <w:noProof/>
                 <w:webHidden/>
               </w:rPr>
-              <w:instrText xml:space="preserve"> PAGEREF _Toc197526679 \h </w:instrText>
+              <w:instrText xml:space="preserve"> PAGEREF _Toc197627342 \h </w:instrText>
             </w:r>
             <w:r>
               <w:rPr>
@@ -1444,7 +1444,7 @@
               <w:lang w:eastAsia="es-CO"/>
             </w:rPr>
           </w:pPr>
-          <w:hyperlink w:anchor="_Toc197526680" w:history="1">
+          <w:hyperlink w:anchor="_Toc197627343" w:history="1">
             <w:r>
               <w:rPr>
                 <w:rStyle w:val="Hipervnculo"/>
@@ -1494,7 +1494,7 @@
                 <w:noProof/>
                 <w:webHidden/>
               </w:rPr>
-              <w:instrText xml:space="preserve"> PAGEREF _Toc197526680 \h </w:instrText>
+              <w:instrText xml:space="preserve"> PAGEREF _Toc197627343 \h </w:instrText>
             </w:r>
             <w:r>
               <w:rPr>
@@ -1540,7 +1540,7 @@
               <w:lang w:eastAsia="es-CO"/>
             </w:rPr>
           </w:pPr>
-          <w:hyperlink w:anchor="_Toc197526681" w:history="1">
+          <w:hyperlink w:anchor="_Toc197627344" w:history="1">
             <w:r>
               <w:rPr>
                 <w:rStyle w:val="Hipervnculo"/>
@@ -1590,7 +1590,7 @@
                 <w:noProof/>
                 <w:webHidden/>
               </w:rPr>
-              <w:instrText xml:space="preserve"> PAGEREF _Toc197526681 \h </w:instrText>
+              <w:instrText xml:space="preserve"> PAGEREF _Toc197627344 \h </w:instrText>
             </w:r>
             <w:r>
               <w:rPr>
@@ -1636,7 +1636,7 @@
               <w:lang w:eastAsia="es-CO"/>
             </w:rPr>
           </w:pPr>
-          <w:hyperlink w:anchor="_Toc197526682" w:history="1">
+          <w:hyperlink w:anchor="_Toc197627345" w:history="1">
             <w:r>
               <w:rPr>
                 <w:rStyle w:val="Hipervnculo"/>
@@ -1686,7 +1686,7 @@
                 <w:noProof/>
                 <w:webHidden/>
               </w:rPr>
-              <w:instrText xml:space="preserve"> PAGEREF _Toc197526682 \h </w:instrText>
+              <w:instrText xml:space="preserve"> PAGEREF _Toc197627345 \h </w:instrText>
             </w:r>
             <w:r>
               <w:rPr>
@@ -1732,7 +1732,7 @@
               <w:lang w:eastAsia="es-CO"/>
             </w:rPr>
           </w:pPr>
-          <w:hyperlink w:anchor="_Toc197526683" w:history="1">
+          <w:hyperlink w:anchor="_Toc197627346" w:history="1">
             <w:r>
               <w:rPr>
                 <w:rStyle w:val="Hipervnculo"/>
@@ -1782,7 +1782,7 @@
                 <w:noProof/>
                 <w:webHidden/>
               </w:rPr>
-              <w:instrText xml:space="preserve"> PAGEREF _Toc197526683 \h </w:instrText>
+              <w:instrText xml:space="preserve"> PAGEREF _Toc197627346 \h </w:instrText>
             </w:r>
             <w:r>
               <w:rPr>
@@ -1828,7 +1828,7 @@
               <w:lang w:eastAsia="es-CO"/>
             </w:rPr>
           </w:pPr>
-          <w:hyperlink w:anchor="_Toc197526684" w:history="1">
+          <w:hyperlink w:anchor="_Toc197627347" w:history="1">
             <w:r>
               <w:rPr>
                 <w:rStyle w:val="Hipervnculo"/>
@@ -1878,7 +1878,7 @@
                 <w:noProof/>
                 <w:webHidden/>
               </w:rPr>
-              <w:instrText xml:space="preserve"> PAGEREF _Toc197526684 \h </w:instrText>
+              <w:instrText xml:space="preserve"> PAGEREF _Toc197627347 \h </w:instrText>
             </w:r>
             <w:r>
               <w:rPr>
@@ -1923,7 +1923,7 @@
               <w:lang w:eastAsia="es-CO"/>
             </w:rPr>
           </w:pPr>
-          <w:hyperlink w:anchor="_Toc197526685" w:history="1">
+          <w:hyperlink w:anchor="_Toc197627348" w:history="1">
             <w:r>
               <w:rPr>
                 <w:rStyle w:val="Hipervnculo"/>
@@ -1950,7 +1950,7 @@
                 <w:noProof/>
                 <w:webHidden/>
               </w:rPr>
-              <w:instrText xml:space="preserve"> PAGEREF _Toc197526685 \h </w:instrText>
+              <w:instrText xml:space="preserve"> PAGEREF _Toc197627348 \h </w:instrText>
             </w:r>
             <w:r>
               <w:rPr>
@@ -1995,7 +1995,7 @@
               <w:lang w:eastAsia="es-CO"/>
             </w:rPr>
           </w:pPr>
-          <w:hyperlink w:anchor="_Toc197526686" w:history="1">
+          <w:hyperlink w:anchor="_Toc197627349" w:history="1">
             <w:r>
               <w:rPr>
                 <w:rStyle w:val="Hipervnculo"/>
@@ -2022,7 +2022,7 @@
                 <w:noProof/>
                 <w:webHidden/>
               </w:rPr>
-              <w:instrText xml:space="preserve"> PAGEREF _Toc197526686 \h </w:instrText>
+              <w:instrText xml:space="preserve"> PAGEREF _Toc197627349 \h </w:instrText>
             </w:r>
             <w:r>
               <w:rPr>
@@ -2067,7 +2067,7 @@
               <w:lang w:eastAsia="es-CO"/>
             </w:rPr>
           </w:pPr>
-          <w:hyperlink w:anchor="_Toc197526687" w:history="1">
+          <w:hyperlink w:anchor="_Toc197627350" w:history="1">
             <w:r>
               <w:rPr>
                 <w:rStyle w:val="Hipervnculo"/>
@@ -2094,7 +2094,7 @@
                 <w:noProof/>
                 <w:webHidden/>
               </w:rPr>
-              <w:instrText xml:space="preserve"> PAGEREF _Toc197526687 \h </w:instrText>
+              <w:instrText xml:space="preserve"> PAGEREF _Toc197627350 \h </w:instrText>
             </w:r>
             <w:r>
               <w:rPr>
@@ -2139,7 +2139,7 @@
               <w:lang w:eastAsia="es-CO"/>
             </w:rPr>
           </w:pPr>
-          <w:hyperlink w:anchor="_Toc197526688" w:history="1">
+          <w:hyperlink w:anchor="_Toc197627351" w:history="1">
             <w:r>
               <w:rPr>
                 <w:rStyle w:val="Hipervnculo"/>
@@ -2166,7 +2166,7 @@
                 <w:noProof/>
                 <w:webHidden/>
               </w:rPr>
-              <w:instrText xml:space="preserve"> PAGEREF _Toc197526688 \h </w:instrText>
+              <w:instrText xml:space="preserve"> PAGEREF _Toc197627351 \h </w:instrText>
             </w:r>
             <w:r>
               <w:rPr>
@@ -2211,7 +2211,7 @@
               <w:lang w:eastAsia="es-CO"/>
             </w:rPr>
           </w:pPr>
-          <w:hyperlink w:anchor="_Toc197526689" w:history="1">
+          <w:hyperlink w:anchor="_Toc197627352" w:history="1">
             <w:r>
               <w:rPr>
                 <w:rStyle w:val="Hipervnculo"/>
@@ -2238,7 +2238,7 @@
                 <w:noProof/>
                 <w:webHidden/>
               </w:rPr>
-              <w:instrText xml:space="preserve"> PAGEREF _Toc197526689 \h </w:instrText>
+              <w:instrText xml:space="preserve"> PAGEREF _Toc197627352 \h </w:instrText>
             </w:r>
             <w:r>
               <w:rPr>
@@ -2280,7 +2280,7 @@
       <w:pPr>
         <w:pStyle w:val="Titulosgenerales"/>
       </w:pPr>
-      <w:bookmarkStart w:id="0" w:name="_Toc197526670"/>
+      <w:bookmarkStart w:id="0" w:name="_Toc197627333"/>
       <w:r>
         <w:lastRenderedPageBreak/>
         <w:t>Introducción</w:t>
@@ -2318,7 +2318,7 @@
           <w:lang w:val="es-CO"/>
         </w:rPr>
       </w:pPr>
-      <w:bookmarkStart w:id="1" w:name="_Toc197526671"/>
+      <w:bookmarkStart w:id="1" w:name="_Toc197627334"/>
       <w:r>
         <w:rPr>
           <w:lang w:val="es-CO"/>
@@ -2441,7 +2441,7 @@
       <w:pPr>
         <w:pStyle w:val="Ttulo2"/>
       </w:pPr>
-      <w:bookmarkStart w:id="2" w:name="_Toc197526672"/>
+      <w:bookmarkStart w:id="2" w:name="_Toc197627335"/>
       <w:r>
         <w:t>Política contable</w:t>
       </w:r>
@@ -2694,7 +2694,7 @@
       <w:pPr>
         <w:pStyle w:val="Ttulo2"/>
       </w:pPr>
-      <w:bookmarkStart w:id="3" w:name="_Toc197526673"/>
+      <w:bookmarkStart w:id="3" w:name="_Toc197627336"/>
       <w:r>
         <w:t>Instrumentos financieros</w:t>
       </w:r>
@@ -2942,8 +2942,16 @@
           <w:p>
             <w:pPr>
               <w:pStyle w:val="TextoTablas"/>
-            </w:pPr>
-            <w:r>
+              <w:rPr>
+                <w:b/>
+                <w:bCs/>
+              </w:rPr>
+            </w:pPr>
+            <w:r>
+              <w:rPr>
+                <w:b/>
+                <w:bCs/>
+              </w:rPr>
               <w:t>Total, facturado</w:t>
             </w:r>
           </w:p>
@@ -3830,13 +3838,7 @@
         <w:rPr>
           <w:lang w:eastAsia="es-CO"/>
         </w:rPr>
-        <w:t>Reconocimiento por cobro de crédito</w:t>
-      </w:r>
-      <w:r>
-        <w:rPr>
-          <w:lang w:eastAsia="es-CO"/>
-        </w:rPr>
-        <w:t>.</w:t>
+        <w:t>Reconocimiento por cobro de crédito.</w:t>
       </w:r>
     </w:p>
     <w:p>
@@ -4334,7 +4336,7 @@
       <w:pPr>
         <w:pStyle w:val="Ttulo2"/>
       </w:pPr>
-      <w:bookmarkStart w:id="4" w:name="_Toc197526674"/>
+      <w:bookmarkStart w:id="4" w:name="_Toc197627337"/>
       <w:r>
         <w:t>Obligaciones con terceros</w:t>
       </w:r>
@@ -4557,31 +4559,7 @@
                 <w:bCs/>
                 <w:lang w:val="es-CO"/>
               </w:rPr>
-              <w:t>-</w:t>
-            </w:r>
-            <w:r>
-              <w:rPr>
-                <w:b/>
-                <w:bCs/>
-                <w:lang w:val="es-CO"/>
-              </w:rPr>
-              <w:t>$120.000</w:t>
-            </w:r>
-            <w:r>
-              <w:rPr>
-                <w:b/>
-                <w:bCs/>
-                <w:lang w:val="es-CO"/>
-              </w:rPr>
-              <w:t>,</w:t>
-            </w:r>
-            <w:r>
-              <w:rPr>
-                <w:b/>
-                <w:bCs/>
-                <w:lang w:val="es-CO"/>
-              </w:rPr>
-              <w:t>00</w:t>
+              <w:t>-$120.000,00</w:t>
             </w:r>
           </w:p>
         </w:tc>
@@ -5309,7 +5287,7 @@
       <w:pPr>
         <w:pStyle w:val="Ttulo2"/>
       </w:pPr>
-      <w:bookmarkStart w:id="5" w:name="_Toc197526675"/>
+      <w:bookmarkStart w:id="5" w:name="_Toc197627338"/>
       <w:r>
         <w:t>Pasivos contingentes</w:t>
       </w:r>
@@ -5419,7 +5397,7 @@
       <w:pPr>
         <w:pStyle w:val="Ttulo2"/>
       </w:pPr>
-      <w:bookmarkStart w:id="6" w:name="_Toc197526676"/>
+      <w:bookmarkStart w:id="6" w:name="_Toc197627339"/>
       <w:r>
         <w:t>Diferencia entre pasivo financiero e instrumento de patrimonio</w:t>
       </w:r>
@@ -5468,7 +5446,7 @@
       <w:pPr>
         <w:pStyle w:val="Ttulo2"/>
       </w:pPr>
-      <w:bookmarkStart w:id="7" w:name="_Toc197526677"/>
+      <w:bookmarkStart w:id="7" w:name="_Toc197627340"/>
       <w:r>
         <w:t>Instrumentos financieros pasivos y activos</w:t>
       </w:r>
@@ -8209,7 +8187,7 @@
       <w:pPr>
         <w:pStyle w:val="Ttulo2"/>
       </w:pPr>
-      <w:bookmarkStart w:id="8" w:name="_Toc197526678"/>
+      <w:bookmarkStart w:id="8" w:name="_Toc197627341"/>
       <w:r>
         <w:t>Reconocimiento, medición, presentación, revelación</w:t>
       </w:r>
@@ -8449,7 +8427,7 @@
         <w:rPr>
           <w:lang w:val="es-419" w:eastAsia="es-CO"/>
         </w:rPr>
-        <w:t>= $ 40.468.926,49</w:t>
+        <w:t>= $40.468.926,49</w:t>
       </w:r>
     </w:p>
     <w:p>
@@ -9350,7 +9328,7 @@
       <w:pPr>
         <w:pStyle w:val="Ttulo1"/>
       </w:pPr>
-      <w:bookmarkStart w:id="9" w:name="_Toc197526679"/>
+      <w:bookmarkStart w:id="9" w:name="_Toc197627342"/>
       <w:r>
         <w:lastRenderedPageBreak/>
         <w:t>Instrumentos de patrimonio</w:t>
@@ -9413,7 +9391,7 @@
       <w:pPr>
         <w:pStyle w:val="Ttulo2"/>
       </w:pPr>
-      <w:bookmarkStart w:id="10" w:name="_Toc197526680"/>
+      <w:bookmarkStart w:id="10" w:name="_Toc197627343"/>
       <w:r>
         <w:t>Reconocimiento, medición, presentación, revelación</w:t>
       </w:r>
@@ -10479,7 +10457,7 @@
       <w:pPr>
         <w:pStyle w:val="Ttulo2"/>
       </w:pPr>
-      <w:bookmarkStart w:id="11" w:name="_Toc197526681"/>
+      <w:bookmarkStart w:id="11" w:name="_Toc197627344"/>
       <w:r>
         <w:t>Aportes de capital</w:t>
       </w:r>
@@ -11088,263 +11066,1295 @@
     </w:p>
     <w:p>
       <w:pPr>
-        <w:pStyle w:val="Figura"/>
-        <w:rPr>
-          <w:lang w:val="es-419"/>
-        </w:rPr>
-      </w:pPr>
-      <w:proofErr w:type="spellStart"/>
-      <w:r>
-        <w:rPr>
-          <w:lang w:val="es-419"/>
-        </w:rPr>
-        <w:t>xxxx</w:t>
-      </w:r>
-      <w:proofErr w:type="spellEnd"/>
+        <w:rPr>
+          <w:lang w:val="es-419" w:eastAsia="es-CO"/>
+        </w:rPr>
+      </w:pPr>
     </w:p>
     <w:p>
       <w:pPr>
-        <w:jc w:val="center"/>
-        <w:rPr>
-          <w:lang w:val="es-419" w:eastAsia="es-CO"/>
-        </w:rPr>
-      </w:pPr>
-      <w:r>
-        <w:rPr>
-          <w:noProof/>
-          <w:lang w:val="es-419" w:eastAsia="es-CO"/>
-        </w:rPr>
-        <w:drawing>
-          <wp:inline distT="0" distB="0" distL="0" distR="0" wp14:anchorId="4D0F4A45" wp14:editId="72FB6FBB">
-            <wp:extent cx="3752850" cy="1562100"/>
-            <wp:effectExtent l="0" t="0" r="0" b="0"/>
-            <wp:docPr id="132388329" name="Imagen 7"/>
-            <wp:cNvGraphicFramePr>
-              <a:graphicFrameLocks xmlns:a="http://schemas.openxmlformats.org/drawingml/2006/main" noChangeAspect="1"/>
-            </wp:cNvGraphicFramePr>
-            <a:graphic xmlns:a="http://schemas.openxmlformats.org/drawingml/2006/main">
-              <a:graphicData uri="http://schemas.openxmlformats.org/drawingml/2006/picture">
-                <pic:pic xmlns:pic="http://schemas.openxmlformats.org/drawingml/2006/picture">
-                  <pic:nvPicPr>
-                    <pic:cNvPr id="0" name="Picture 3"/>
-                    <pic:cNvPicPr>
-                      <a:picLocks noChangeAspect="1" noChangeArrowheads="1"/>
-                    </pic:cNvPicPr>
-                  </pic:nvPicPr>
-                  <pic:blipFill>
-                    <a:blip r:embed="rId10">
-                      <a:extLst>
-                        <a:ext uri="{28A0092B-C50C-407E-A947-70E740481C1C}">
-                          <a14:useLocalDpi xmlns:a14="http://schemas.microsoft.com/office/drawing/2010/main" val="0"/>
-                        </a:ext>
-                      </a:extLst>
-                    </a:blip>
-                    <a:srcRect/>
-                    <a:stretch>
-                      <a:fillRect/>
-                    </a:stretch>
-                  </pic:blipFill>
-                  <pic:spPr bwMode="auto">
-                    <a:xfrm>
-                      <a:off x="0" y="0"/>
-                      <a:ext cx="3752850" cy="1562100"/>
-                    </a:xfrm>
-                    <a:prstGeom prst="rect">
-                      <a:avLst/>
-                    </a:prstGeom>
-                    <a:noFill/>
-                  </pic:spPr>
-                </pic:pic>
-              </a:graphicData>
-            </a:graphic>
-          </wp:inline>
-        </w:drawing>
+        <w:pStyle w:val="Sinespaciado"/>
+        <w:rPr>
+          <w:lang w:val="es-419" w:eastAsia="es-CO"/>
+        </w:rPr>
+      </w:pPr>
+      <w:r>
+        <w:rPr>
+          <w:lang w:val="es-419" w:eastAsia="es-CO"/>
+        </w:rPr>
+        <w:t>Capital autorizado</w:t>
+      </w:r>
+      <w:r>
+        <w:rPr>
+          <w:lang w:val="es-419" w:eastAsia="es-CO"/>
+        </w:rPr>
+        <w:t xml:space="preserve">                                      </w:t>
+      </w:r>
+      <w:r>
+        <w:rPr>
+          <w:lang w:val="es-419" w:eastAsia="es-CO"/>
+        </w:rPr>
+        <w:tab/>
+      </w:r>
+      <w:r>
+        <w:rPr>
+          <w:lang w:val="es-419" w:eastAsia="es-CO"/>
+        </w:rPr>
+        <w:t>120.000 acciones</w:t>
       </w:r>
     </w:p>
     <w:p>
       <w:pPr>
-        <w:pStyle w:val="Figura"/>
-        <w:rPr>
-          <w:lang w:val="es-419"/>
-        </w:rPr>
-      </w:pPr>
-      <w:proofErr w:type="spellStart"/>
-      <w:r>
-        <w:rPr>
-          <w:lang w:val="es-419"/>
-        </w:rPr>
-        <w:t>xxxx</w:t>
-      </w:r>
-      <w:proofErr w:type="spellEnd"/>
+        <w:pStyle w:val="Sinespaciado"/>
+        <w:rPr>
+          <w:lang w:val="es-419" w:eastAsia="es-CO"/>
+        </w:rPr>
+      </w:pPr>
+      <w:r>
+        <w:rPr>
+          <w:lang w:val="es-419" w:eastAsia="es-CO"/>
+        </w:rPr>
+        <w:t>Valor por acción</w:t>
+      </w:r>
+      <w:r>
+        <w:rPr>
+          <w:lang w:val="es-419" w:eastAsia="es-CO"/>
+        </w:rPr>
+        <w:tab/>
+      </w:r>
+      <w:r>
+        <w:rPr>
+          <w:lang w:val="es-419" w:eastAsia="es-CO"/>
+        </w:rPr>
+        <w:tab/>
+      </w:r>
+      <w:r>
+        <w:rPr>
+          <w:lang w:val="es-419" w:eastAsia="es-CO"/>
+        </w:rPr>
+        <w:tab/>
+      </w:r>
+      <w:r>
+        <w:rPr>
+          <w:lang w:val="es-419" w:eastAsia="es-CO"/>
+        </w:rPr>
+        <w:tab/>
+      </w:r>
+      <w:r>
+        <w:rPr>
+          <w:lang w:val="es-419" w:eastAsia="es-CO"/>
+        </w:rPr>
+        <w:tab/>
+        <w:t xml:space="preserve">               2.500,00</w:t>
+      </w:r>
     </w:p>
     <w:p>
       <w:pPr>
-        <w:jc w:val="center"/>
-        <w:rPr>
-          <w:lang w:val="es-419" w:eastAsia="es-CO"/>
-        </w:rPr>
-      </w:pPr>
-      <w:r>
-        <w:rPr>
-          <w:noProof/>
-          <w:lang w:val="es-419" w:eastAsia="es-CO"/>
-        </w:rPr>
-        <w:drawing>
-          <wp:inline distT="0" distB="0" distL="0" distR="0" wp14:anchorId="5D4C0EA3" wp14:editId="346FE398">
-            <wp:extent cx="3733800" cy="1714500"/>
-            <wp:effectExtent l="0" t="0" r="0" b="0"/>
-            <wp:docPr id="1013506677" name="Imagen 9"/>
-            <wp:cNvGraphicFramePr>
-              <a:graphicFrameLocks xmlns:a="http://schemas.openxmlformats.org/drawingml/2006/main" noChangeAspect="1"/>
-            </wp:cNvGraphicFramePr>
-            <a:graphic xmlns:a="http://schemas.openxmlformats.org/drawingml/2006/main">
-              <a:graphicData uri="http://schemas.openxmlformats.org/drawingml/2006/picture">
-                <pic:pic xmlns:pic="http://schemas.openxmlformats.org/drawingml/2006/picture">
-                  <pic:nvPicPr>
-                    <pic:cNvPr id="0" name="Picture 4"/>
-                    <pic:cNvPicPr>
-                      <a:picLocks noChangeAspect="1" noChangeArrowheads="1"/>
-                    </pic:cNvPicPr>
-                  </pic:nvPicPr>
-                  <pic:blipFill>
-                    <a:blip r:embed="rId11">
-                      <a:extLst>
-                        <a:ext uri="{28A0092B-C50C-407E-A947-70E740481C1C}">
-                          <a14:useLocalDpi xmlns:a14="http://schemas.microsoft.com/office/drawing/2010/main" val="0"/>
-                        </a:ext>
-                      </a:extLst>
-                    </a:blip>
-                    <a:srcRect/>
-                    <a:stretch>
-                      <a:fillRect/>
-                    </a:stretch>
-                  </pic:blipFill>
-                  <pic:spPr bwMode="auto">
-                    <a:xfrm>
-                      <a:off x="0" y="0"/>
-                      <a:ext cx="3733800" cy="1714500"/>
-                    </a:xfrm>
-                    <a:prstGeom prst="rect">
-                      <a:avLst/>
-                    </a:prstGeom>
-                    <a:noFill/>
-                  </pic:spPr>
-                </pic:pic>
-              </a:graphicData>
-            </a:graphic>
-          </wp:inline>
-        </w:drawing>
+        <w:pStyle w:val="Sinespaciado"/>
+        <w:rPr>
+          <w:lang w:val="es-419" w:eastAsia="es-CO"/>
+        </w:rPr>
+      </w:pPr>
+      <w:r>
+        <w:rPr>
+          <w:lang w:val="es-419" w:eastAsia="es-CO"/>
+        </w:rPr>
+        <w:tab/>
+      </w:r>
+      <w:r>
+        <w:rPr>
+          <w:lang w:val="es-419" w:eastAsia="es-CO"/>
+        </w:rPr>
+        <w:tab/>
+      </w:r>
+      <w:r>
+        <w:rPr>
+          <w:lang w:val="es-419" w:eastAsia="es-CO"/>
+        </w:rPr>
+        <w:tab/>
+      </w:r>
+      <w:r>
+        <w:rPr>
+          <w:lang w:val="es-419" w:eastAsia="es-CO"/>
+        </w:rPr>
+        <w:tab/>
+      </w:r>
+      <w:r>
+        <w:rPr>
+          <w:lang w:val="es-419" w:eastAsia="es-CO"/>
+        </w:rPr>
+        <w:tab/>
+      </w:r>
+      <w:r>
+        <w:rPr>
+          <w:lang w:val="es-419" w:eastAsia="es-CO"/>
+        </w:rPr>
+        <w:tab/>
+      </w:r>
+      <w:r>
+        <w:rPr>
+          <w:lang w:val="es-419" w:eastAsia="es-CO"/>
+        </w:rPr>
+        <w:tab/>
+      </w:r>
+      <w:r>
+        <w:rPr>
+          <w:lang w:val="es-419" w:eastAsia="es-CO"/>
+        </w:rPr>
+        <w:t>______________</w:t>
       </w:r>
     </w:p>
     <w:p>
       <w:pPr>
-        <w:pStyle w:val="Ttulo3"/>
-      </w:pPr>
-      <w:r>
-        <w:lastRenderedPageBreak/>
-        <w:t>Presentación</w:t>
+        <w:pStyle w:val="Sinespaciado"/>
+        <w:rPr>
+          <w:lang w:val="es-419" w:eastAsia="es-CO"/>
+        </w:rPr>
+      </w:pPr>
+      <w:r>
+        <w:rPr>
+          <w:lang w:val="es-419" w:eastAsia="es-CO"/>
+        </w:rPr>
+        <w:t>Valor total</w:t>
+      </w:r>
+      <w:r>
+        <w:rPr>
+          <w:lang w:val="es-419" w:eastAsia="es-CO"/>
+        </w:rPr>
+        <w:tab/>
+      </w:r>
+      <w:r>
+        <w:rPr>
+          <w:lang w:val="es-419" w:eastAsia="es-CO"/>
+        </w:rPr>
+        <w:tab/>
+      </w:r>
+      <w:r>
+        <w:rPr>
+          <w:lang w:val="es-419" w:eastAsia="es-CO"/>
+        </w:rPr>
+        <w:tab/>
+      </w:r>
+      <w:r>
+        <w:rPr>
+          <w:lang w:val="es-419" w:eastAsia="es-CO"/>
+        </w:rPr>
+        <w:tab/>
+      </w:r>
+      <w:r>
+        <w:rPr>
+          <w:lang w:val="es-419" w:eastAsia="es-CO"/>
+        </w:rPr>
+        <w:tab/>
+      </w:r>
+      <w:r>
+        <w:rPr>
+          <w:lang w:val="es-419" w:eastAsia="es-CO"/>
+        </w:rPr>
+        <w:tab/>
+        <w:t xml:space="preserve">         300.000.000</w:t>
       </w:r>
     </w:p>
     <w:p>
       <w:pPr>
-        <w:rPr>
-          <w:lang w:val="es-419" w:eastAsia="es-CO"/>
-        </w:rPr>
-      </w:pPr>
-      <w:r>
-        <w:rPr>
-          <w:lang w:val="es-419" w:eastAsia="es-CO"/>
-        </w:rPr>
-        <w:t>A continuación, se presenta el estado de situación financiera inicial de la empresa:</w:t>
+        <w:pStyle w:val="Sinespaciado"/>
+        <w:rPr>
+          <w:lang w:val="es-419" w:eastAsia="es-CO"/>
+        </w:rPr>
+      </w:pPr>
+      <w:r>
+        <w:rPr>
+          <w:lang w:val="es-419" w:eastAsia="es-CO"/>
+        </w:rPr>
+        <w:t>Capital suscrito</w:t>
+      </w:r>
+      <w:r>
+        <w:rPr>
+          <w:lang w:val="es-419" w:eastAsia="es-CO"/>
+        </w:rPr>
+        <w:tab/>
+      </w:r>
+      <w:r>
+        <w:rPr>
+          <w:lang w:val="es-419" w:eastAsia="es-CO"/>
+        </w:rPr>
+        <w:tab/>
+      </w:r>
+      <w:r>
+        <w:rPr>
+          <w:lang w:val="es-419" w:eastAsia="es-CO"/>
+        </w:rPr>
+        <w:tab/>
+      </w:r>
+      <w:r>
+        <w:rPr>
+          <w:lang w:val="es-419" w:eastAsia="es-CO"/>
+        </w:rPr>
+        <w:tab/>
+      </w:r>
+      <w:r>
+        <w:rPr>
+          <w:lang w:val="es-419" w:eastAsia="es-CO"/>
+        </w:rPr>
+        <w:tab/>
+      </w:r>
+      <w:r>
+        <w:rPr>
+          <w:lang w:val="es-419" w:eastAsia="es-CO"/>
+        </w:rPr>
+        <w:tab/>
+      </w:r>
+      <w:r>
+        <w:rPr>
+          <w:lang w:val="es-419" w:eastAsia="es-CO"/>
+        </w:rPr>
+        <w:tab/>
+        <w:t>50 %</w:t>
       </w:r>
     </w:p>
     <w:p>
       <w:pPr>
-        <w:pStyle w:val="Figura"/>
-        <w:rPr>
-          <w:lang w:val="es-419"/>
-        </w:rPr>
-      </w:pPr>
-      <w:proofErr w:type="spellStart"/>
-      <w:r>
-        <w:rPr>
-          <w:lang w:val="es-419"/>
-        </w:rPr>
-        <w:t>xxxxx</w:t>
-      </w:r>
-      <w:proofErr w:type="spellEnd"/>
+        <w:pStyle w:val="Sinespaciado"/>
+        <w:rPr>
+          <w:lang w:val="es-419" w:eastAsia="es-CO"/>
+        </w:rPr>
+      </w:pPr>
     </w:p>
     <w:p>
       <w:pPr>
-        <w:jc w:val="center"/>
-        <w:rPr>
-          <w:lang w:val="es-419" w:eastAsia="es-CO"/>
-        </w:rPr>
-      </w:pPr>
-      <w:r>
-        <w:rPr>
-          <w:noProof/>
-          <w:lang w:val="es-419" w:eastAsia="es-CO"/>
-        </w:rPr>
-        <w:drawing>
-          <wp:inline distT="0" distB="0" distL="0" distR="0" wp14:anchorId="384D5B6E" wp14:editId="7DB87F96">
-            <wp:extent cx="3762375" cy="6105525"/>
-            <wp:effectExtent l="0" t="0" r="9525" b="9525"/>
-            <wp:docPr id="861483269" name="Imagen 11"/>
-            <wp:cNvGraphicFramePr>
-              <a:graphicFrameLocks xmlns:a="http://schemas.openxmlformats.org/drawingml/2006/main" noChangeAspect="1"/>
-            </wp:cNvGraphicFramePr>
-            <a:graphic xmlns:a="http://schemas.openxmlformats.org/drawingml/2006/main">
-              <a:graphicData uri="http://schemas.openxmlformats.org/drawingml/2006/picture">
-                <pic:pic xmlns:pic="http://schemas.openxmlformats.org/drawingml/2006/picture">
-                  <pic:nvPicPr>
-                    <pic:cNvPr id="0" name="Picture 5"/>
-                    <pic:cNvPicPr>
-                      <a:picLocks noChangeAspect="1" noChangeArrowheads="1"/>
-                    </pic:cNvPicPr>
-                  </pic:nvPicPr>
-                  <pic:blipFill>
-                    <a:blip r:embed="rId12">
-                      <a:extLst>
-                        <a:ext uri="{28A0092B-C50C-407E-A947-70E740481C1C}">
-                          <a14:useLocalDpi xmlns:a14="http://schemas.microsoft.com/office/drawing/2010/main" val="0"/>
-                        </a:ext>
-                      </a:extLst>
-                    </a:blip>
-                    <a:srcRect/>
-                    <a:stretch>
-                      <a:fillRect/>
-                    </a:stretch>
-                  </pic:blipFill>
-                  <pic:spPr bwMode="auto">
-                    <a:xfrm>
-                      <a:off x="0" y="0"/>
-                      <a:ext cx="3762375" cy="6105525"/>
-                    </a:xfrm>
-                    <a:prstGeom prst="rect">
-                      <a:avLst/>
-                    </a:prstGeom>
-                    <a:noFill/>
-                  </pic:spPr>
-                </pic:pic>
-              </a:graphicData>
-            </a:graphic>
-          </wp:inline>
-        </w:drawing>
-      </w:r>
+        <w:pStyle w:val="Sinespaciado"/>
+        <w:rPr>
+          <w:lang w:val="es-419" w:eastAsia="es-CO"/>
+        </w:rPr>
+      </w:pPr>
     </w:p>
     <w:p>
       <w:pPr>
-        <w:rPr>
-          <w:lang w:val="es-419" w:eastAsia="es-CO"/>
-        </w:rPr>
-      </w:pPr>
+        <w:pStyle w:val="Sinespaciado"/>
+        <w:rPr>
+          <w:lang w:val="es-419" w:eastAsia="es-CO"/>
+        </w:rPr>
+      </w:pPr>
+      <w:r>
+        <w:rPr>
+          <w:lang w:val="es-419" w:eastAsia="es-CO"/>
+        </w:rPr>
+        <w:t>Total,</w:t>
+      </w:r>
+      <w:r>
+        <w:rPr>
+          <w:lang w:val="es-419" w:eastAsia="es-CO"/>
+        </w:rPr>
+        <w:t xml:space="preserve"> suscrito</w:t>
+      </w:r>
+      <w:r>
+        <w:rPr>
+          <w:lang w:val="es-419" w:eastAsia="es-CO"/>
+        </w:rPr>
+        <w:tab/>
+      </w:r>
+      <w:r>
+        <w:rPr>
+          <w:lang w:val="es-419" w:eastAsia="es-CO"/>
+        </w:rPr>
+        <w:t xml:space="preserve">                                      </w:t>
+      </w:r>
+      <w:r>
+        <w:rPr>
+          <w:lang w:val="es-419" w:eastAsia="es-CO"/>
+        </w:rPr>
+        <w:tab/>
+      </w:r>
+      <w:r>
+        <w:rPr>
+          <w:lang w:val="es-419" w:eastAsia="es-CO"/>
+        </w:rPr>
+        <w:t xml:space="preserve">        150.000.000</w:t>
+      </w:r>
     </w:p>
     <w:p>
       <w:pPr>
+        <w:pStyle w:val="Sinespaciado"/>
+        <w:rPr>
+          <w:lang w:val="es-419" w:eastAsia="es-CO"/>
+        </w:rPr>
+      </w:pPr>
+      <w:r>
+        <w:rPr>
+          <w:lang w:val="es-419" w:eastAsia="es-CO"/>
+        </w:rPr>
+        <w:t>Pagado</w:t>
+      </w:r>
+      <w:r>
+        <w:rPr>
+          <w:lang w:val="es-419" w:eastAsia="es-CO"/>
+        </w:rPr>
+        <w:tab/>
+      </w:r>
+      <w:r>
+        <w:rPr>
+          <w:lang w:val="es-419" w:eastAsia="es-CO"/>
+        </w:rPr>
+        <w:tab/>
+      </w:r>
+      <w:r>
+        <w:rPr>
+          <w:lang w:val="es-419" w:eastAsia="es-CO"/>
+        </w:rPr>
+        <w:tab/>
+      </w:r>
+      <w:r>
+        <w:rPr>
+          <w:lang w:val="es-419" w:eastAsia="es-CO"/>
+        </w:rPr>
+        <w:tab/>
+      </w:r>
+      <w:r>
+        <w:rPr>
+          <w:lang w:val="es-419" w:eastAsia="es-CO"/>
+        </w:rPr>
+        <w:tab/>
+      </w:r>
+      <w:r>
+        <w:rPr>
+          <w:lang w:val="es-419" w:eastAsia="es-CO"/>
+        </w:rPr>
+        <w:tab/>
+        <w:t xml:space="preserve">               </w:t>
+      </w:r>
+      <w:r>
+        <w:rPr>
+          <w:lang w:val="es-419" w:eastAsia="es-CO"/>
+        </w:rPr>
+        <w:tab/>
+        <w:t>70 %</w:t>
+      </w:r>
+    </w:p>
+    <w:p>
+      <w:pPr>
+        <w:pStyle w:val="Sinespaciado"/>
+        <w:rPr>
+          <w:lang w:val="es-419" w:eastAsia="es-CO"/>
+        </w:rPr>
+      </w:pPr>
+      <w:r>
+        <w:rPr>
+          <w:lang w:val="es-419" w:eastAsia="es-CO"/>
+        </w:rPr>
+        <w:tab/>
+      </w:r>
+      <w:r>
+        <w:rPr>
+          <w:lang w:val="es-419" w:eastAsia="es-CO"/>
+        </w:rPr>
+        <w:tab/>
+      </w:r>
+      <w:r>
+        <w:rPr>
+          <w:lang w:val="es-419" w:eastAsia="es-CO"/>
+        </w:rPr>
+        <w:tab/>
+      </w:r>
+      <w:r>
+        <w:rPr>
+          <w:lang w:val="es-419" w:eastAsia="es-CO"/>
+        </w:rPr>
+        <w:tab/>
+      </w:r>
+      <w:r>
+        <w:rPr>
+          <w:lang w:val="es-419" w:eastAsia="es-CO"/>
+        </w:rPr>
+        <w:tab/>
+      </w:r>
+      <w:r>
+        <w:rPr>
+          <w:lang w:val="es-419" w:eastAsia="es-CO"/>
+        </w:rPr>
+        <w:tab/>
+      </w:r>
+      <w:r>
+        <w:rPr>
+          <w:lang w:val="es-419" w:eastAsia="es-CO"/>
+        </w:rPr>
+        <w:tab/>
+      </w:r>
+      <w:r>
+        <w:rPr>
+          <w:lang w:val="es-419" w:eastAsia="es-CO"/>
+        </w:rPr>
+        <w:t>______________</w:t>
+      </w:r>
+    </w:p>
+    <w:p>
+      <w:pPr>
+        <w:pStyle w:val="Sinespaciado"/>
+        <w:rPr>
+          <w:lang w:val="es-419" w:eastAsia="es-CO"/>
+        </w:rPr>
+      </w:pPr>
+      <w:r>
+        <w:rPr>
+          <w:lang w:val="es-419" w:eastAsia="es-CO"/>
+        </w:rPr>
+        <w:t>Total, capital pagado</w:t>
+      </w:r>
+      <w:r>
+        <w:rPr>
+          <w:lang w:val="es-419" w:eastAsia="es-CO"/>
+        </w:rPr>
+        <w:tab/>
+      </w:r>
+      <w:r>
+        <w:rPr>
+          <w:lang w:val="es-419" w:eastAsia="es-CO"/>
+        </w:rPr>
+        <w:tab/>
+      </w:r>
+      <w:r>
+        <w:rPr>
+          <w:lang w:val="es-419" w:eastAsia="es-CO"/>
+        </w:rPr>
+        <w:tab/>
+      </w:r>
+      <w:r>
+        <w:rPr>
+          <w:lang w:val="es-419" w:eastAsia="es-CO"/>
+        </w:rPr>
+        <w:tab/>
+        <w:t xml:space="preserve">         </w:t>
+      </w:r>
+      <w:r>
+        <w:rPr>
+          <w:lang w:val="es-419" w:eastAsia="es-CO"/>
+        </w:rPr>
+        <w:t>105</w:t>
+      </w:r>
+      <w:r>
+        <w:rPr>
+          <w:lang w:val="es-419" w:eastAsia="es-CO"/>
+        </w:rPr>
+        <w:t>.000.000</w:t>
+      </w:r>
+    </w:p>
+    <w:p>
+      <w:pPr>
+        <w:pStyle w:val="Sinespaciado"/>
+        <w:rPr>
+          <w:lang w:val="es-419" w:eastAsia="es-CO"/>
+        </w:rPr>
+      </w:pPr>
+      <w:r>
+        <w:rPr>
+          <w:lang w:val="es-419" w:eastAsia="es-CO"/>
+        </w:rPr>
+        <w:tab/>
+      </w:r>
+      <w:r>
+        <w:rPr>
+          <w:lang w:val="es-419" w:eastAsia="es-CO"/>
+        </w:rPr>
+        <w:tab/>
+      </w:r>
+      <w:r>
+        <w:rPr>
+          <w:lang w:val="es-419" w:eastAsia="es-CO"/>
+        </w:rPr>
+        <w:tab/>
+      </w:r>
+      <w:r>
+        <w:rPr>
+          <w:lang w:val="es-419" w:eastAsia="es-CO"/>
+        </w:rPr>
+        <w:tab/>
+      </w:r>
+      <w:r>
+        <w:rPr>
+          <w:lang w:val="es-419" w:eastAsia="es-CO"/>
+        </w:rPr>
+        <w:tab/>
+      </w:r>
+      <w:r>
+        <w:rPr>
+          <w:lang w:val="es-419" w:eastAsia="es-CO"/>
+        </w:rPr>
+        <w:tab/>
+      </w:r>
+      <w:r>
+        <w:rPr>
+          <w:lang w:val="es-419" w:eastAsia="es-CO"/>
+        </w:rPr>
+        <w:tab/>
+        <w:t>______________</w:t>
+      </w:r>
+    </w:p>
+    <w:p>
+      <w:pPr>
+        <w:rPr>
+          <w:lang w:val="es-419" w:eastAsia="es-CO"/>
+        </w:rPr>
+      </w:pPr>
+      <w:r>
+        <w:rPr>
+          <w:lang w:val="es-419" w:eastAsia="es-CO"/>
+        </w:rPr>
+        <w:t>Capital por pagar</w:t>
+      </w:r>
+      <w:r>
+        <w:rPr>
+          <w:lang w:val="es-419" w:eastAsia="es-CO"/>
+        </w:rPr>
+        <w:tab/>
+      </w:r>
+      <w:r>
+        <w:rPr>
+          <w:lang w:val="es-419" w:eastAsia="es-CO"/>
+        </w:rPr>
+        <w:tab/>
+      </w:r>
+      <w:r>
+        <w:rPr>
+          <w:lang w:val="es-419" w:eastAsia="es-CO"/>
+        </w:rPr>
+        <w:tab/>
+      </w:r>
+      <w:r>
+        <w:rPr>
+          <w:lang w:val="es-419" w:eastAsia="es-CO"/>
+        </w:rPr>
+        <w:tab/>
+      </w:r>
+      <w:r>
+        <w:rPr>
+          <w:lang w:val="es-419" w:eastAsia="es-CO"/>
+        </w:rPr>
+        <w:tab/>
+      </w:r>
+      <w:r>
+        <w:rPr>
+          <w:lang w:val="es-419" w:eastAsia="es-CO"/>
+        </w:rPr>
+        <w:tab/>
+        <w:t>45.000.000</w:t>
+      </w:r>
+    </w:p>
+    <w:p>
+      <w:pPr>
+        <w:pStyle w:val="Ttulo3"/>
+      </w:pPr>
+      <w:r>
+        <w:t>Presentación</w:t>
+      </w:r>
+    </w:p>
+    <w:p>
+      <w:pPr>
+        <w:rPr>
+          <w:lang w:val="es-419" w:eastAsia="es-CO"/>
+        </w:rPr>
+      </w:pPr>
+      <w:r>
+        <w:rPr>
+          <w:lang w:val="es-419" w:eastAsia="es-CO"/>
+        </w:rPr>
+        <w:t>A continuación, se presenta el estado de situación financiera inicial de la empresa:</w:t>
+      </w:r>
+    </w:p>
+    <w:p>
+      <w:pPr>
+        <w:rPr>
+          <w:lang w:val="es-419" w:eastAsia="es-CO"/>
+        </w:rPr>
+      </w:pPr>
+    </w:p>
+    <w:p>
+      <w:pPr>
+        <w:rPr>
+          <w:lang w:val="es-419" w:eastAsia="es-CO"/>
+        </w:rPr>
+      </w:pPr>
+    </w:p>
+    <w:p>
+      <w:pPr>
+        <w:pStyle w:val="Sinespaciado"/>
+        <w:rPr>
+          <w:lang w:val="es-419" w:eastAsia="es-CO"/>
+        </w:rPr>
+      </w:pPr>
+      <w:r>
+        <w:rPr>
+          <w:lang w:val="es-419" w:eastAsia="es-CO"/>
+        </w:rPr>
+        <w:lastRenderedPageBreak/>
+        <w:t>Aprendiendo S.A.</w:t>
+      </w:r>
+    </w:p>
+    <w:p>
+      <w:pPr>
+        <w:pStyle w:val="Sinespaciado"/>
+        <w:rPr>
+          <w:lang w:val="es-419" w:eastAsia="es-CO"/>
+        </w:rPr>
+      </w:pPr>
+      <w:r>
+        <w:rPr>
+          <w:lang w:val="es-419" w:eastAsia="es-CO"/>
+        </w:rPr>
+        <w:t>Estados de situación Financiera Inicial</w:t>
+      </w:r>
+    </w:p>
+    <w:p>
+      <w:pPr>
+        <w:pStyle w:val="Sinespaciado"/>
+        <w:rPr>
+          <w:lang w:val="es-419" w:eastAsia="es-CO"/>
+        </w:rPr>
+      </w:pPr>
+      <w:r>
+        <w:rPr>
+          <w:lang w:val="es-419" w:eastAsia="es-CO"/>
+        </w:rPr>
+        <w:t>A 1/1/17</w:t>
+      </w:r>
+    </w:p>
+    <w:p>
+      <w:pPr>
+        <w:rPr>
+          <w:lang w:val="es-419" w:eastAsia="es-CO"/>
+        </w:rPr>
+      </w:pPr>
+    </w:p>
+    <w:p>
+      <w:pPr>
+        <w:rPr>
+          <w:b/>
+          <w:bCs/>
+          <w:lang w:val="es-419" w:eastAsia="es-CO"/>
+        </w:rPr>
+      </w:pPr>
+      <w:r>
+        <w:rPr>
+          <w:b/>
+          <w:bCs/>
+          <w:lang w:val="es-419" w:eastAsia="es-CO"/>
+        </w:rPr>
+        <w:t>Activos</w:t>
+      </w:r>
+    </w:p>
+    <w:p>
+      <w:pPr>
+        <w:pStyle w:val="Sinespaciado"/>
+        <w:rPr>
+          <w:lang w:val="es-419" w:eastAsia="es-CO"/>
+        </w:rPr>
+      </w:pPr>
+      <w:r>
+        <w:rPr>
+          <w:lang w:val="es-419" w:eastAsia="es-CO"/>
+        </w:rPr>
+        <w:t>Activo corriente</w:t>
+      </w:r>
+    </w:p>
+    <w:p>
+      <w:pPr>
+        <w:pStyle w:val="Sinespaciado"/>
+        <w:rPr>
+          <w:lang w:val="es-419" w:eastAsia="es-CO"/>
+        </w:rPr>
+      </w:pPr>
+    </w:p>
+    <w:p>
+      <w:pPr>
+        <w:pStyle w:val="Sinespaciado"/>
+        <w:rPr>
+          <w:lang w:val="es-419" w:eastAsia="es-CO"/>
+        </w:rPr>
+      </w:pPr>
+      <w:r>
+        <w:rPr>
+          <w:lang w:eastAsia="es-CO"/>
+        </w:rPr>
+        <w:t>E</w:t>
+      </w:r>
+      <w:r>
+        <w:rPr>
+          <w:lang w:eastAsia="es-CO"/>
+        </w:rPr>
+        <w:t>fectivo y sus equivalentes</w:t>
+      </w:r>
+      <w:r>
+        <w:rPr>
+          <w:lang w:val="es-419" w:eastAsia="es-CO"/>
+        </w:rPr>
+        <w:tab/>
+      </w:r>
+      <w:r>
+        <w:rPr>
+          <w:lang w:val="es-419" w:eastAsia="es-CO"/>
+        </w:rPr>
+        <w:tab/>
+      </w:r>
+      <w:r>
+        <w:rPr>
+          <w:lang w:val="es-419" w:eastAsia="es-CO"/>
+        </w:rPr>
+        <w:tab/>
+        <w:t xml:space="preserve">      $105.000.000</w:t>
+      </w:r>
+    </w:p>
+    <w:p>
+      <w:pPr>
+        <w:pStyle w:val="Sinespaciado"/>
+        <w:rPr>
+          <w:lang w:val="es-419" w:eastAsia="es-CO"/>
+        </w:rPr>
+      </w:pPr>
+      <w:r>
+        <w:rPr>
+          <w:lang w:val="es-419" w:eastAsia="es-CO"/>
+        </w:rPr>
+        <w:t>Total, activos</w:t>
+      </w:r>
+      <w:r>
+        <w:rPr>
+          <w:lang w:val="es-419" w:eastAsia="es-CO"/>
+        </w:rPr>
+        <w:tab/>
+      </w:r>
+      <w:r>
+        <w:rPr>
+          <w:lang w:val="es-419" w:eastAsia="es-CO"/>
+        </w:rPr>
+        <w:tab/>
+      </w:r>
+      <w:r>
+        <w:rPr>
+          <w:lang w:val="es-419" w:eastAsia="es-CO"/>
+        </w:rPr>
+        <w:tab/>
+      </w:r>
+      <w:r>
+        <w:rPr>
+          <w:lang w:val="es-419" w:eastAsia="es-CO"/>
+        </w:rPr>
+        <w:tab/>
+      </w:r>
+      <w:r>
+        <w:rPr>
+          <w:lang w:val="es-419" w:eastAsia="es-CO"/>
+        </w:rPr>
+        <w:tab/>
+        <w:t xml:space="preserve">      $105.000.000</w:t>
+      </w:r>
+    </w:p>
+    <w:p>
+      <w:pPr>
+        <w:pStyle w:val="Sinespaciado"/>
+        <w:rPr>
+          <w:lang w:val="es-419" w:eastAsia="es-CO"/>
+        </w:rPr>
+      </w:pPr>
+    </w:p>
+    <w:p>
+      <w:pPr>
+        <w:pStyle w:val="Sinespaciado"/>
+        <w:rPr>
+          <w:lang w:val="es-419" w:eastAsia="es-CO"/>
+        </w:rPr>
+      </w:pPr>
+    </w:p>
+    <w:p>
+      <w:pPr>
+        <w:pStyle w:val="Sinespaciado"/>
+        <w:rPr>
+          <w:lang w:val="es-419" w:eastAsia="es-CO"/>
+        </w:rPr>
+      </w:pPr>
+      <w:r>
+        <w:rPr>
+          <w:b/>
+          <w:bCs/>
+          <w:lang w:eastAsia="es-CO"/>
+        </w:rPr>
+        <w:t>Pasivos</w:t>
+      </w:r>
+    </w:p>
+    <w:p>
+      <w:pPr>
+        <w:pStyle w:val="Sinespaciado"/>
+        <w:rPr>
+          <w:lang w:val="es-419" w:eastAsia="es-CO"/>
+        </w:rPr>
+      </w:pPr>
+      <w:r>
+        <w:rPr>
+          <w:lang w:val="es-419" w:eastAsia="es-CO"/>
+        </w:rPr>
+        <w:tab/>
+      </w:r>
+      <w:r>
+        <w:rPr>
+          <w:lang w:val="es-419" w:eastAsia="es-CO"/>
+        </w:rPr>
+        <w:tab/>
+      </w:r>
+      <w:r>
+        <w:rPr>
+          <w:lang w:val="es-419" w:eastAsia="es-CO"/>
+        </w:rPr>
+        <w:tab/>
+      </w:r>
+      <w:r>
+        <w:rPr>
+          <w:lang w:val="es-419" w:eastAsia="es-CO"/>
+        </w:rPr>
+        <w:tab/>
+      </w:r>
+      <w:r>
+        <w:rPr>
+          <w:lang w:val="es-419" w:eastAsia="es-CO"/>
+        </w:rPr>
+        <w:tab/>
+      </w:r>
+      <w:r>
+        <w:rPr>
+          <w:lang w:val="es-419" w:eastAsia="es-CO"/>
+        </w:rPr>
+        <w:tab/>
+      </w:r>
+      <w:r>
+        <w:rPr>
+          <w:lang w:val="es-419" w:eastAsia="es-CO"/>
+        </w:rPr>
+        <w:tab/>
+      </w:r>
+    </w:p>
+    <w:p>
+      <w:pPr>
+        <w:pStyle w:val="Sinespaciado"/>
+        <w:rPr>
+          <w:lang w:val="es-419" w:eastAsia="es-CO"/>
+        </w:rPr>
+      </w:pPr>
+      <w:r>
+        <w:rPr>
+          <w:lang w:val="es-419" w:eastAsia="es-CO"/>
+        </w:rPr>
+        <w:t>Total, pasivos</w:t>
+      </w:r>
+      <w:r>
+        <w:rPr>
+          <w:lang w:val="es-419" w:eastAsia="es-CO"/>
+        </w:rPr>
+        <w:tab/>
+      </w:r>
+      <w:r>
+        <w:rPr>
+          <w:lang w:val="es-419" w:eastAsia="es-CO"/>
+        </w:rPr>
+        <w:tab/>
+      </w:r>
+      <w:r>
+        <w:rPr>
+          <w:lang w:val="es-419" w:eastAsia="es-CO"/>
+        </w:rPr>
+        <w:tab/>
+      </w:r>
+      <w:r>
+        <w:rPr>
+          <w:lang w:val="es-419" w:eastAsia="es-CO"/>
+        </w:rPr>
+        <w:tab/>
+      </w:r>
+      <w:r>
+        <w:rPr>
+          <w:lang w:val="es-419" w:eastAsia="es-CO"/>
+        </w:rPr>
+        <w:tab/>
+        <w:t xml:space="preserve">      </w:t>
+      </w:r>
+      <w:r>
+        <w:rPr>
+          <w:lang w:val="es-419" w:eastAsia="es-CO"/>
+        </w:rPr>
+        <w:tab/>
+      </w:r>
+      <w:r>
+        <w:rPr>
+          <w:lang w:val="es-419" w:eastAsia="es-CO"/>
+        </w:rPr>
+        <w:tab/>
+        <w:t xml:space="preserve">    </w:t>
+      </w:r>
+      <w:r>
+        <w:rPr>
+          <w:lang w:val="es-419" w:eastAsia="es-CO"/>
+        </w:rPr>
+        <w:t>$0</w:t>
+      </w:r>
+    </w:p>
+    <w:p>
+      <w:pPr>
+        <w:rPr>
+          <w:lang w:val="es-419" w:eastAsia="es-CO"/>
+        </w:rPr>
+      </w:pPr>
+    </w:p>
+    <w:p>
+      <w:pPr>
+        <w:pStyle w:val="Sinespaciado"/>
+        <w:rPr>
+          <w:b/>
+          <w:bCs/>
+          <w:lang w:val="es-419" w:eastAsia="es-CO"/>
+        </w:rPr>
+      </w:pPr>
+      <w:r>
+        <w:rPr>
+          <w:b/>
+          <w:bCs/>
+          <w:lang w:val="es-419" w:eastAsia="es-CO"/>
+        </w:rPr>
+        <w:t>Patrimonio</w:t>
+      </w:r>
+    </w:p>
+    <w:p>
+      <w:pPr>
+        <w:pStyle w:val="Sinespaciado"/>
+        <w:rPr>
+          <w:b/>
+          <w:bCs/>
+          <w:lang w:val="es-419" w:eastAsia="es-CO"/>
+        </w:rPr>
+      </w:pPr>
+      <w:r>
+        <w:rPr>
+          <w:b/>
+          <w:bCs/>
+          <w:lang w:val="es-419" w:eastAsia="es-CO"/>
+        </w:rPr>
+        <w:t>Capital social</w:t>
+      </w:r>
+    </w:p>
+    <w:p>
+      <w:pPr>
+        <w:pStyle w:val="Sinespaciado"/>
+        <w:rPr>
+          <w:lang w:eastAsia="es-CO"/>
+        </w:rPr>
+      </w:pPr>
+    </w:p>
+    <w:p>
+      <w:pPr>
+        <w:pStyle w:val="Sinespaciado"/>
+        <w:rPr>
+          <w:lang w:val="es-419" w:eastAsia="es-CO"/>
+        </w:rPr>
+      </w:pPr>
+      <w:r>
+        <w:rPr>
+          <w:lang w:eastAsia="es-CO"/>
+        </w:rPr>
+        <w:t>Capital autorizado</w:t>
+      </w:r>
+      <w:r>
+        <w:rPr>
+          <w:lang w:eastAsia="es-CO"/>
+        </w:rPr>
+        <w:tab/>
+      </w:r>
+      <w:r>
+        <w:rPr>
+          <w:lang w:eastAsia="es-CO"/>
+        </w:rPr>
+        <w:tab/>
+      </w:r>
+      <w:r>
+        <w:rPr>
+          <w:lang w:val="es-419" w:eastAsia="es-CO"/>
+        </w:rPr>
+        <w:tab/>
+      </w:r>
+      <w:r>
+        <w:rPr>
+          <w:lang w:val="es-419" w:eastAsia="es-CO"/>
+        </w:rPr>
+        <w:tab/>
+      </w:r>
+      <w:r>
+        <w:rPr>
+          <w:lang w:val="es-419" w:eastAsia="es-CO"/>
+        </w:rPr>
+        <w:tab/>
+        <w:t xml:space="preserve">      $</w:t>
+      </w:r>
+      <w:r>
+        <w:rPr>
+          <w:lang w:val="es-419" w:eastAsia="es-CO"/>
+        </w:rPr>
+        <w:t>300</w:t>
+      </w:r>
+      <w:r>
+        <w:rPr>
+          <w:lang w:val="es-419" w:eastAsia="es-CO"/>
+        </w:rPr>
+        <w:t>.000.000</w:t>
+      </w:r>
+    </w:p>
+    <w:p>
+      <w:pPr>
+        <w:pStyle w:val="Sinespaciado"/>
+        <w:rPr>
+          <w:lang w:eastAsia="es-CO"/>
+        </w:rPr>
+      </w:pPr>
+    </w:p>
+    <w:p>
+      <w:pPr>
+        <w:pStyle w:val="Sinespaciado"/>
+        <w:rPr>
+          <w:lang w:val="es-419" w:eastAsia="es-CO"/>
+        </w:rPr>
+      </w:pPr>
+      <w:r>
+        <w:rPr>
+          <w:lang w:eastAsia="es-CO"/>
+        </w:rPr>
+        <w:t>Capital por suscribir</w:t>
+      </w:r>
+      <w:r>
+        <w:rPr>
+          <w:lang w:eastAsia="es-CO"/>
+        </w:rPr>
+        <w:tab/>
+      </w:r>
+      <w:r>
+        <w:rPr>
+          <w:lang w:val="es-419" w:eastAsia="es-CO"/>
+        </w:rPr>
+        <w:tab/>
+      </w:r>
+      <w:r>
+        <w:rPr>
+          <w:lang w:val="es-419" w:eastAsia="es-CO"/>
+        </w:rPr>
+        <w:tab/>
+      </w:r>
+      <w:r>
+        <w:rPr>
+          <w:lang w:val="es-419" w:eastAsia="es-CO"/>
+        </w:rPr>
+        <w:tab/>
+        <w:t xml:space="preserve">   </w:t>
+      </w:r>
+      <w:r>
+        <w:rPr>
+          <w:lang w:val="es-419" w:eastAsia="es-CO"/>
+        </w:rPr>
+        <w:t xml:space="preserve"> </w:t>
+      </w:r>
+      <w:r>
+        <w:rPr>
+          <w:lang w:val="es-419" w:eastAsia="es-CO"/>
+        </w:rPr>
+        <w:t>$</w:t>
+      </w:r>
+      <w:r>
+        <w:rPr>
+          <w:lang w:val="es-419" w:eastAsia="es-CO"/>
+        </w:rPr>
+        <w:t>(</w:t>
+      </w:r>
+      <w:r>
+        <w:rPr>
+          <w:lang w:val="es-419" w:eastAsia="es-CO"/>
+        </w:rPr>
+        <w:t>15</w:t>
+      </w:r>
+      <w:r>
+        <w:rPr>
+          <w:lang w:val="es-419" w:eastAsia="es-CO"/>
+        </w:rPr>
+        <w:t>0</w:t>
+      </w:r>
+      <w:r>
+        <w:rPr>
+          <w:lang w:val="es-419" w:eastAsia="es-CO"/>
+        </w:rPr>
+        <w:t>.000.000</w:t>
+      </w:r>
+      <w:r>
+        <w:rPr>
+          <w:lang w:val="es-419" w:eastAsia="es-CO"/>
+        </w:rPr>
+        <w:t>)</w:t>
+      </w:r>
+    </w:p>
+    <w:p>
+      <w:pPr>
+        <w:pStyle w:val="Sinespaciado"/>
+        <w:rPr>
+          <w:lang w:eastAsia="es-CO"/>
+        </w:rPr>
+      </w:pPr>
+    </w:p>
+    <w:p>
+      <w:pPr>
+        <w:pStyle w:val="Sinespaciado"/>
+        <w:rPr>
+          <w:lang w:val="es-419" w:eastAsia="es-CO"/>
+        </w:rPr>
+      </w:pPr>
+      <w:r>
+        <w:rPr>
+          <w:lang w:eastAsia="es-CO"/>
+        </w:rPr>
+        <w:t>Capital suscrito por cobrar</w:t>
+      </w:r>
+      <w:r>
+        <w:rPr>
+          <w:lang w:val="es-419" w:eastAsia="es-CO"/>
+        </w:rPr>
+        <w:tab/>
+      </w:r>
+      <w:r>
+        <w:rPr>
+          <w:lang w:val="es-419" w:eastAsia="es-CO"/>
+        </w:rPr>
+        <w:tab/>
+      </w:r>
+      <w:r>
+        <w:rPr>
+          <w:lang w:val="es-419" w:eastAsia="es-CO"/>
+        </w:rPr>
+        <w:tab/>
+        <w:t xml:space="preserve">      $</w:t>
+      </w:r>
+      <w:r>
+        <w:rPr>
+          <w:lang w:val="es-419" w:eastAsia="es-CO"/>
+        </w:rPr>
+        <w:t>(4</w:t>
+      </w:r>
+      <w:r>
+        <w:rPr>
+          <w:lang w:val="es-419" w:eastAsia="es-CO"/>
+        </w:rPr>
+        <w:t>5.000.000</w:t>
+      </w:r>
+      <w:r>
+        <w:rPr>
+          <w:lang w:val="es-419" w:eastAsia="es-CO"/>
+        </w:rPr>
+        <w:t>)</w:t>
+      </w:r>
+    </w:p>
+    <w:p>
+      <w:pPr>
+        <w:pStyle w:val="Sinespaciado"/>
+        <w:rPr>
+          <w:lang w:eastAsia="es-CO"/>
+        </w:rPr>
+      </w:pPr>
+    </w:p>
+    <w:p>
+      <w:pPr>
+        <w:pStyle w:val="Sinespaciado"/>
+        <w:rPr>
+          <w:lang w:val="es-419" w:eastAsia="es-CO"/>
+        </w:rPr>
+      </w:pPr>
+      <w:r>
+        <w:rPr>
+          <w:lang w:eastAsia="es-CO"/>
+        </w:rPr>
+        <w:t>Total, patrimonio</w:t>
+      </w:r>
+      <w:r>
+        <w:rPr>
+          <w:lang w:eastAsia="es-CO"/>
+        </w:rPr>
+        <w:tab/>
+      </w:r>
+      <w:r>
+        <w:rPr>
+          <w:lang w:eastAsia="es-CO"/>
+        </w:rPr>
+        <w:tab/>
+      </w:r>
+      <w:r>
+        <w:rPr>
+          <w:lang w:val="es-419" w:eastAsia="es-CO"/>
+        </w:rPr>
+        <w:tab/>
+      </w:r>
+      <w:r>
+        <w:rPr>
+          <w:lang w:val="es-419" w:eastAsia="es-CO"/>
+        </w:rPr>
+        <w:tab/>
+      </w:r>
+      <w:r>
+        <w:rPr>
+          <w:lang w:val="es-419" w:eastAsia="es-CO"/>
+        </w:rPr>
+        <w:tab/>
+        <w:t xml:space="preserve">      $105.000.000</w:t>
+      </w:r>
+    </w:p>
+    <w:p>
+      <w:pPr>
+        <w:pStyle w:val="Sinespaciado"/>
+        <w:rPr>
+          <w:lang w:eastAsia="es-CO"/>
+        </w:rPr>
+      </w:pPr>
+    </w:p>
+    <w:p>
+      <w:pPr>
+        <w:pStyle w:val="Sinespaciado"/>
+        <w:rPr>
+          <w:lang w:val="es-419" w:eastAsia="es-CO"/>
+        </w:rPr>
+      </w:pPr>
+      <w:r>
+        <w:rPr>
+          <w:lang w:eastAsia="es-CO"/>
+        </w:rPr>
+        <w:t>Total, pasivo y patrimonio</w:t>
+      </w:r>
+      <w:r>
+        <w:rPr>
+          <w:lang w:val="es-419" w:eastAsia="es-CO"/>
+        </w:rPr>
+        <w:tab/>
+      </w:r>
+      <w:r>
+        <w:rPr>
+          <w:lang w:val="es-419" w:eastAsia="es-CO"/>
+        </w:rPr>
+        <w:tab/>
+      </w:r>
+      <w:r>
+        <w:rPr>
+          <w:lang w:val="es-419" w:eastAsia="es-CO"/>
+        </w:rPr>
+        <w:tab/>
+        <w:t xml:space="preserve">      $105.000.000</w:t>
+      </w:r>
+    </w:p>
+    <w:p>
+      <w:pPr>
+        <w:pStyle w:val="Sinespaciado"/>
+        <w:rPr>
+          <w:lang w:val="es-419" w:eastAsia="es-CO"/>
+        </w:rPr>
+      </w:pPr>
+    </w:p>
+    <w:p>
+      <w:pPr>
         <w:pStyle w:val="Ttulo2"/>
       </w:pPr>
-      <w:bookmarkStart w:id="12" w:name="_Toc197526682"/>
+      <w:bookmarkStart w:id="12" w:name="_Toc197627345"/>
       <w:r>
         <w:lastRenderedPageBreak/>
         <w:t>Ganancias acumuladas</w:t>
@@ -11381,7 +12391,7 @@
       <w:pPr>
         <w:pStyle w:val="Ttulo2"/>
       </w:pPr>
-      <w:bookmarkStart w:id="13" w:name="_Toc197526683"/>
+      <w:bookmarkStart w:id="13" w:name="_Toc197627346"/>
       <w:r>
         <w:t>Reservas</w:t>
       </w:r>
@@ -11412,91 +12422,55 @@
           <w:bCs/>
           <w:lang w:val="es-419" w:eastAsia="es-CO"/>
         </w:rPr>
-        <w:t>Art. 452</w:t>
-      </w:r>
-      <w:r>
-        <w:rPr>
-          <w:b/>
-          <w:bCs/>
+        <w:t>Art. 452. Reserva legal</w:t>
+      </w:r>
+      <w:r>
+        <w:rPr>
           <w:lang w:val="es-419" w:eastAsia="es-CO"/>
         </w:rPr>
         <w:t xml:space="preserve">. </w:t>
       </w:r>
       <w:r>
         <w:rPr>
-          <w:b/>
-          <w:bCs/>
-          <w:lang w:val="es-419" w:eastAsia="es-CO"/>
-        </w:rPr>
-        <w:t>Reserva legal</w:t>
-      </w:r>
-      <w:r>
-        <w:rPr>
-          <w:lang w:val="es-419" w:eastAsia="es-CO"/>
-        </w:rPr>
-        <w:t xml:space="preserve">. </w:t>
-      </w:r>
-      <w:r>
-        <w:rPr>
-          <w:lang w:val="es-419" w:eastAsia="es-CO"/>
-        </w:rPr>
-        <w:t xml:space="preserve">Las sociedades anónimas constituirán una reserva legal que ascenderá por lo menos al cincuenta por ciento del capital suscrito, formada con el diez por ciento de las utilidades líquidas de cada ejercicio. Cuando esta reserva llegue al cincuenta por ciento mencionado, la sociedad no tendrá obligación de continuar llevando a esta cuenta el diez por ciento de las utilidades líquidas. Pero si disminuye, volverá a apropiarse el mismo diez por ciento de tales utilidades hasta cuando la reserva llegue nuevamente al límite fijado. </w:t>
-      </w:r>
-      <w:proofErr w:type="spellStart"/>
-      <w:r>
-        <w:rPr>
-          <w:lang w:val="es-419" w:eastAsia="es-CO"/>
-        </w:rPr>
-        <w:t>Conc</w:t>
-      </w:r>
-      <w:proofErr w:type="spellEnd"/>
-      <w:r>
-        <w:rPr>
-          <w:lang w:val="es-419" w:eastAsia="es-CO"/>
-        </w:rPr>
-        <w:t xml:space="preserve">.: 110 </w:t>
-      </w:r>
-      <w:proofErr w:type="spellStart"/>
-      <w:r>
-        <w:rPr>
-          <w:lang w:val="es-419" w:eastAsia="es-CO"/>
-        </w:rPr>
-        <w:t>num</w:t>
-      </w:r>
-      <w:proofErr w:type="spellEnd"/>
-      <w:r>
-        <w:rPr>
-          <w:lang w:val="es-419" w:eastAsia="es-CO"/>
-        </w:rPr>
-        <w:t xml:space="preserve">. 8o, 154, 271 </w:t>
-      </w:r>
-      <w:proofErr w:type="spellStart"/>
-      <w:r>
-        <w:rPr>
-          <w:lang w:val="es-419" w:eastAsia="es-CO"/>
-        </w:rPr>
-        <w:t>num</w:t>
-      </w:r>
-      <w:proofErr w:type="spellEnd"/>
-      <w:r>
-        <w:rPr>
-          <w:lang w:val="es-419" w:eastAsia="es-CO"/>
-        </w:rPr>
-        <w:t xml:space="preserve">. 4o, 272 </w:t>
-      </w:r>
-      <w:proofErr w:type="spellStart"/>
-      <w:r>
-        <w:rPr>
-          <w:lang w:val="es-419" w:eastAsia="es-CO"/>
-        </w:rPr>
-        <w:t>num</w:t>
-      </w:r>
-      <w:proofErr w:type="spellEnd"/>
-      <w:r>
-        <w:rPr>
-          <w:lang w:val="es-419" w:eastAsia="es-CO"/>
-        </w:rPr>
-        <w:t>. 5o., 350, 371, 454, 456, 476. (Legis. 2020).</w:t>
+          <w:lang w:val="es-419" w:eastAsia="es-CO"/>
+        </w:rPr>
+        <w:t xml:space="preserve">Las sociedades anónimas constituirán una reserva legal que ascenderá por lo menos al cincuenta por ciento del capital suscrito, formada con el diez por ciento de las utilidades líquidas de cada ejercicio. Cuando esta reserva llegue al cincuenta por ciento mencionado, la sociedad no tendrá obligación de continuar llevando a esta cuenta el diez por ciento de las utilidades líquidas. Pero si disminuye, volverá a apropiarse el mismo diez por ciento de tales utilidades hasta cuando la reserva llegue nuevamente al límite fijado. Conc.: 110 </w:t>
+      </w:r>
+      <w:r>
+        <w:rPr>
+          <w:lang w:val="es-419" w:eastAsia="es-CO"/>
+        </w:rPr>
+        <w:t>núm.</w:t>
+      </w:r>
+      <w:r>
+        <w:rPr>
+          <w:lang w:val="es-419" w:eastAsia="es-CO"/>
+        </w:rPr>
+        <w:t xml:space="preserve"> 8o, 154, 271 </w:t>
+      </w:r>
+      <w:r>
+        <w:rPr>
+          <w:lang w:val="es-419" w:eastAsia="es-CO"/>
+        </w:rPr>
+        <w:t>núm.</w:t>
+      </w:r>
+      <w:r>
+        <w:rPr>
+          <w:lang w:val="es-419" w:eastAsia="es-CO"/>
+        </w:rPr>
+        <w:t xml:space="preserve"> 4o, 272 </w:t>
+      </w:r>
+      <w:r>
+        <w:rPr>
+          <w:lang w:val="es-419" w:eastAsia="es-CO"/>
+        </w:rPr>
+        <w:t>núm.</w:t>
+      </w:r>
+      <w:r>
+        <w:rPr>
+          <w:lang w:val="es-419" w:eastAsia="es-CO"/>
+        </w:rPr>
+        <w:t xml:space="preserve"> 5o., 350, 371, 454, 456, 476. (Legis. 2020).</w:t>
       </w:r>
     </w:p>
     <w:p>
@@ -11512,23 +12486,7 @@
           <w:lang w:eastAsia="es-CO"/>
         </w:rPr>
         <w:lastRenderedPageBreak/>
-        <w:t>Art. 453</w:t>
-      </w:r>
-      <w:r>
-        <w:rPr>
-          <w:b/>
-          <w:bCs/>
-          <w:lang w:eastAsia="es-CO"/>
-        </w:rPr>
-        <w:t xml:space="preserve">. </w:t>
-      </w:r>
-      <w:r>
-        <w:rPr>
-          <w:b/>
-          <w:bCs/>
-          <w:lang w:eastAsia="es-CO"/>
-        </w:rPr>
-        <w:t>Reservas estatutarias y ocasionales</w:t>
+        <w:t>Art. 453. Reservas estatutarias y ocasionales</w:t>
       </w:r>
       <w:r>
         <w:rPr>
@@ -11971,7 +12929,7 @@
       <w:pPr>
         <w:pStyle w:val="Ttulo2"/>
       </w:pPr>
-      <w:bookmarkStart w:id="14" w:name="_Toc197526684"/>
+      <w:bookmarkStart w:id="14" w:name="_Toc197627347"/>
       <w:r>
         <w:lastRenderedPageBreak/>
         <w:t>Otro resultado integral (ORI)</w:t>
@@ -12596,10 +13554,7 @@
               <w:pStyle w:val="TextoTablas"/>
             </w:pPr>
             <w:r>
-              <w:t>Total,</w:t>
-            </w:r>
-            <w:r>
-              <w:t xml:space="preserve"> ORI</w:t>
+              <w:t>Total, ORI</w:t>
             </w:r>
           </w:p>
         </w:tc>
@@ -12724,97 +13679,73 @@
         <w:rPr>
           <w:lang w:eastAsia="es-CO"/>
         </w:rPr>
-        <w:t xml:space="preserve">7 – “Instrumentos financieros”, </w:t>
+        <w:t xml:space="preserve">7 “Instrumentos financieros”, </w:t>
       </w:r>
       <w:r>
         <w:rPr>
           <w:lang w:eastAsia="es-CO"/>
         </w:rPr>
-        <w:t>Norma Internacional de Información Financiera</w:t>
+        <w:t xml:space="preserve">Norma Internacional de Información Financiera </w:t>
       </w:r>
       <w:r>
         <w:rPr>
           <w:lang w:eastAsia="es-CO"/>
         </w:rPr>
+        <w:t>“</w:t>
+      </w:r>
+      <w:r>
+        <w:rPr>
+          <w:lang w:eastAsia="es-CO"/>
+        </w:rPr>
+        <w:t>NIIF 9 Instrumentos Financieros</w:t>
+      </w:r>
+      <w:r>
+        <w:rPr>
+          <w:lang w:eastAsia="es-CO"/>
+        </w:rPr>
+        <w:t>”</w:t>
+      </w:r>
+      <w:r>
+        <w:rPr>
+          <w:lang w:eastAsia="es-CO"/>
+        </w:rPr>
+        <w:t xml:space="preserve">, </w:t>
+      </w:r>
+      <w:r>
+        <w:rPr>
+          <w:lang w:eastAsia="es-CO"/>
+        </w:rPr>
+        <w:t>Norma Internacional de Contabilidad 1</w:t>
+      </w:r>
+      <w:r>
+        <w:rPr>
+          <w:lang w:eastAsia="es-CO"/>
+        </w:rPr>
         <w:t xml:space="preserve"> </w:t>
       </w:r>
       <w:r>
         <w:rPr>
           <w:lang w:eastAsia="es-CO"/>
         </w:rPr>
-        <w:t>- “</w:t>
+        <w:t>“</w:t>
       </w:r>
       <w:r>
         <w:rPr>
           <w:lang w:eastAsia="es-CO"/>
         </w:rPr>
-        <w:t>NIIF 9 Instrumentos Financieros</w:t>
+        <w:t>Presentación de Estados Financieros</w:t>
       </w:r>
       <w:r>
         <w:rPr>
           <w:lang w:eastAsia="es-CO"/>
         </w:rPr>
-        <w:t>”</w:t>
+        <w:t xml:space="preserve">”, Convergencia con las normas internacionales de información financiera NIFF en Colombia “Activos y pasivos financieros”, </w:t>
       </w:r>
       <w:r>
         <w:rPr>
           <w:lang w:eastAsia="es-CO"/>
         </w:rPr>
-        <w:t xml:space="preserve">, </w:t>
-      </w:r>
-      <w:r>
-        <w:rPr>
-          <w:lang w:eastAsia="es-CO"/>
-        </w:rPr>
-        <w:t>Norma Internacional de Contabilidad 1</w:t>
-      </w:r>
-      <w:r>
-        <w:rPr>
-          <w:lang w:eastAsia="es-CO"/>
-        </w:rPr>
-        <w:t xml:space="preserve"> </w:t>
-      </w:r>
-      <w:r>
-        <w:rPr>
-          <w:lang w:eastAsia="es-CO"/>
-        </w:rPr>
-        <w:t xml:space="preserve">- </w:t>
-      </w:r>
-      <w:r>
-        <w:rPr>
-          <w:lang w:eastAsia="es-CO"/>
-        </w:rPr>
-        <w:t>“</w:t>
-      </w:r>
-      <w:r>
-        <w:rPr>
-          <w:lang w:eastAsia="es-CO"/>
-        </w:rPr>
-        <w:t>Presentación de Estados Financieros</w:t>
-      </w:r>
-      <w:r>
-        <w:rPr>
-          <w:lang w:eastAsia="es-CO"/>
-        </w:rPr>
-        <w:t xml:space="preserve">”, Convergencia con las normas internacionales de información financiera NIFF en Colombia </w:t>
-      </w:r>
-      <w:r>
-        <w:rPr>
-          <w:lang w:eastAsia="es-CO"/>
-        </w:rPr>
-        <w:t xml:space="preserve">- </w:t>
-      </w:r>
-      <w:r>
-        <w:rPr>
-          <w:lang w:eastAsia="es-CO"/>
-        </w:rPr>
-        <w:t xml:space="preserve">“Activos y pasivos financieros”, </w:t>
-      </w:r>
-      <w:r>
-        <w:rPr>
-          <w:lang w:eastAsia="es-CO"/>
-        </w:rPr>
-        <w:t>Documento de orientación técnica 001 - “Contabilidad bajo los nuevos marcos técnicos normativos”</w:t>
+        <w:t>Documento de orientación técnica 001 “Contabilidad bajo los nuevos marcos técnicos normativos”</w:t>
       </w:r>
       <w:r>
         <w:rPr>
@@ -12864,7 +13795,7 @@
           <w:lang w:val="es-CO"/>
         </w:rPr>
       </w:pPr>
-      <w:bookmarkStart w:id="15" w:name="_Toc197526685"/>
+      <w:bookmarkStart w:id="15" w:name="_Toc197627348"/>
       <w:r>
         <w:rPr>
           <w:lang w:val="es-CO"/>
@@ -12924,10 +13855,10 @@
                     <pic:cNvPicPr/>
                   </pic:nvPicPr>
                   <pic:blipFill>
-                    <a:blip r:embed="rId13">
+                    <a:blip r:embed="rId10">
                       <a:extLst>
                         <a:ext uri="{96DAC541-7B7A-43D3-8B79-37D633B846F1}">
-                          <asvg:svgBlip xmlns:asvg="http://schemas.microsoft.com/office/drawing/2016/SVG/main" r:embed="rId14"/>
+                          <asvg:svgBlip xmlns:asvg="http://schemas.microsoft.com/office/drawing/2016/SVG/main" r:embed="rId11"/>
                         </a:ext>
                       </a:extLst>
                     </a:blip>
@@ -12976,7 +13907,7 @@
           <w:lang w:val="es-CO"/>
         </w:rPr>
       </w:pPr>
-      <w:bookmarkStart w:id="16" w:name="_Toc197526686"/>
+      <w:bookmarkStart w:id="16" w:name="_Toc197627349"/>
       <w:r>
         <w:rPr>
           <w:lang w:val="es-CO"/>
@@ -13160,7 +14091,7 @@
                 <w:rStyle w:val="Hipervnculo"/>
               </w:rPr>
             </w:pPr>
-            <w:hyperlink r:id="rId15" w:history="1">
+            <w:hyperlink r:id="rId12" w:history="1">
               <w:r>
                 <w:rPr>
                   <w:rStyle w:val="Hipervnculo"/>
@@ -13244,7 +14175,7 @@
             <w:pPr>
               <w:pStyle w:val="TextoTablas"/>
             </w:pPr>
-            <w:hyperlink r:id="rId16" w:history="1">
+            <w:hyperlink r:id="rId13" w:history="1">
               <w:r>
                 <w:rPr>
                   <w:rStyle w:val="Hipervnculo"/>
@@ -13331,7 +14262,7 @@
             <w:pPr>
               <w:pStyle w:val="TextoTablas"/>
             </w:pPr>
-            <w:hyperlink r:id="rId17" w:history="1">
+            <w:hyperlink r:id="rId14" w:history="1">
               <w:r>
                 <w:rPr>
                   <w:rStyle w:val="Hipervnculo"/>
@@ -13415,7 +14346,7 @@
             <w:pPr>
               <w:pStyle w:val="TextoTablas"/>
             </w:pPr>
-            <w:hyperlink r:id="rId18" w:history="1">
+            <w:hyperlink r:id="rId15" w:history="1">
               <w:r>
                 <w:rPr>
                   <w:rStyle w:val="Hipervnculo"/>
@@ -13441,7 +14372,7 @@
           <w:lang w:val="es-CO"/>
         </w:rPr>
       </w:pPr>
-      <w:bookmarkStart w:id="17" w:name="_Toc197526687"/>
+      <w:bookmarkStart w:id="17" w:name="_Toc197627350"/>
       <w:r>
         <w:rPr>
           <w:lang w:val="es-CO"/>
@@ -13508,47 +14439,7 @@
         <w:t>Debe y haber: </w:t>
       </w:r>
       <w:r>
-        <w:t xml:space="preserve">es el reconocimiento de que toda cuenta contable presenta aumentos y disminuciones acorde a la naturaleza de las cuentas; en ese sentido, las cuentas de activos, presentan sus aumentos en </w:t>
-      </w:r>
-      <w:proofErr w:type="spellStart"/>
-      <w:r>
-        <w:t>el</w:t>
-      </w:r>
-      <w:proofErr w:type="spellEnd"/>
-      <w:r>
-        <w:t xml:space="preserve"> debe y disminuciones en el haber, para las cuentas del pasivo, los aumentos se realizan en el haber y las disminuciones en </w:t>
-      </w:r>
-      <w:proofErr w:type="spellStart"/>
-      <w:r>
-        <w:t>el</w:t>
-      </w:r>
-      <w:proofErr w:type="spellEnd"/>
-      <w:r>
-        <w:t xml:space="preserve"> debe, para las cuentas del patrimonio, los aumentos se realizan en el haber y las disminuciones en </w:t>
-      </w:r>
-      <w:proofErr w:type="spellStart"/>
-      <w:r>
-        <w:t>el</w:t>
-      </w:r>
-      <w:proofErr w:type="spellEnd"/>
-      <w:r>
-        <w:t xml:space="preserve"> debe, para los ingresos, los aumentos se registran en el haber y las disminuciones en </w:t>
-      </w:r>
-      <w:proofErr w:type="spellStart"/>
-      <w:r>
-        <w:t>el</w:t>
-      </w:r>
-      <w:proofErr w:type="spellEnd"/>
-      <w:r>
-        <w:t xml:space="preserve"> debe, en el caso de los gastos, los aumentos se efectúan en </w:t>
-      </w:r>
-      <w:proofErr w:type="spellStart"/>
-      <w:r>
-        <w:t>el</w:t>
-      </w:r>
-      <w:proofErr w:type="spellEnd"/>
-      <w:r>
-        <w:t xml:space="preserve"> debe, al igual que las cuentas de costos.</w:t>
+        <w:t>es el reconocimiento de que toda cuenta contable presenta aumentos y disminuciones acorde a la naturaleza de las cuentas; en ese sentido, las cuentas de activos, presentan sus aumentos en el debe y disminuciones en el haber, para las cuentas del pasivo, los aumentos se realizan en el haber y las disminuciones en el debe, para las cuentas del patrimonio, los aumentos se realizan en el haber y las disminuciones en el debe, para los ingresos, los aumentos se registran en el haber y las disminuciones en el debe, en el caso de los gastos, los aumentos se efectúan en el debe, al igual que las cuentas de costos.</w:t>
       </w:r>
     </w:p>
     <w:p>
@@ -13589,7 +14480,7 @@
           <w:lang w:val="es-CO"/>
         </w:rPr>
       </w:pPr>
-      <w:bookmarkStart w:id="18" w:name="_Toc197526688"/>
+      <w:bookmarkStart w:id="18" w:name="_Toc197627351"/>
       <w:r>
         <w:rPr>
           <w:lang w:val="es-CO"/>
@@ -13607,20 +14498,11 @@
     </w:p>
     <w:p>
       <w:r>
-        <w:t>Actualícese</w:t>
-      </w:r>
-      <w:r>
-        <w:t xml:space="preserve"> (2020, 10 de diciembre) Método de la tasa de </w:t>
-      </w:r>
-      <w:r>
-        <w:t>interés</w:t>
-      </w:r>
-      <w:r>
-        <w:t xml:space="preserve"> efectiva.</w:t>
+        <w:t>Actualícese (2020, 10 de diciembre) Método de la tasa de interés efectiva.</w:t>
       </w:r>
     </w:p>
     <w:p>
-      <w:hyperlink r:id="rId19" w:history="1">
+      <w:hyperlink r:id="rId16" w:history="1">
         <w:r>
           <w:rPr>
             <w:rStyle w:val="Hipervnculo"/>
@@ -13636,7 +14518,7 @@
       <w:r>
         <w:t xml:space="preserve"> </w:t>
       </w:r>
-      <w:hyperlink r:id="rId20" w:anchor="Reserva_legal_en_la_sociedad_en_la_sociedad_anonima" w:history="1">
+      <w:hyperlink r:id="rId17" w:anchor="Reserva_legal_en_la_sociedad_en_la_sociedad_anonima" w:history="1">
         <w:r>
           <w:rPr>
             <w:rStyle w:val="Hipervnculo"/>
@@ -13651,7 +14533,7 @@
       </w:r>
     </w:p>
     <w:p>
-      <w:hyperlink r:id="rId21" w:history="1">
+      <w:hyperlink r:id="rId18" w:history="1">
         <w:r>
           <w:rPr>
             <w:rStyle w:val="Hipervnculo"/>
@@ -13667,7 +14549,7 @@
       <w:r>
         <w:t xml:space="preserve"> </w:t>
       </w:r>
-      <w:hyperlink r:id="rId22" w:history="1">
+      <w:hyperlink r:id="rId19" w:history="1">
         <w:r>
           <w:rPr>
             <w:rStyle w:val="Hipervnculo"/>
@@ -13683,7 +14565,7 @@
       <w:r>
         <w:t xml:space="preserve"> </w:t>
       </w:r>
-      <w:hyperlink r:id="rId23" w:history="1">
+      <w:hyperlink r:id="rId20" w:history="1">
         <w:r>
           <w:rPr>
             <w:rStyle w:val="Hipervnculo"/>
@@ -13701,7 +14583,7 @@
       </w:r>
     </w:p>
     <w:p>
-      <w:hyperlink r:id="rId24" w:history="1">
+      <w:hyperlink r:id="rId21" w:history="1">
         <w:r>
           <w:rPr>
             <w:rStyle w:val="Hipervnculo"/>
@@ -13722,7 +14604,7 @@
           <w:lang w:val="es-CO"/>
         </w:rPr>
       </w:pPr>
-      <w:bookmarkStart w:id="19" w:name="_Toc197526689"/>
+      <w:bookmarkStart w:id="19" w:name="_Toc197627352"/>
       <w:r>
         <w:rPr>
           <w:lang w:val="es-CO"/>
@@ -14660,12 +15542,13 @@
       </w:pPr>
     </w:p>
     <w:sectPr>
-      <w:headerReference w:type="default" r:id="rId25"/>
-      <w:footerReference w:type="default" r:id="rId26"/>
+      <w:headerReference w:type="default" r:id="rId22"/>
+      <w:footerReference w:type="default" r:id="rId23"/>
       <w:pgSz w:w="12240" w:h="15840"/>
       <w:pgMar w:top="1701" w:right="1134" w:bottom="1134" w:left="1134" w:header="709" w:footer="737" w:gutter="0"/>
       <w:pgNumType w:start="1"/>
       <w:cols w:space="708"/>
+      <w:titlePg/>
       <w:docGrid w:linePitch="381"/>
     </w:sectPr>
   </w:body>
@@ -14901,7 +15784,7 @@
         <w:lang w:eastAsia="es-CO"/>
       </w:rPr>
       <w:drawing>
-        <wp:anchor distT="0" distB="0" distL="114300" distR="114300" simplePos="0" relativeHeight="251659264" behindDoc="0" locked="0" layoutInCell="1" allowOverlap="1" wp14:anchorId="7C04AEC5" wp14:editId="13C06F2B">
+        <wp:anchor distT="0" distB="0" distL="114300" distR="114300" simplePos="0" relativeHeight="251659264" behindDoc="0" locked="0" layoutInCell="1" allowOverlap="1" wp14:anchorId="7C04AEC5" wp14:editId="1CFAE094">
           <wp:simplePos x="0" y="0"/>
           <wp:positionH relativeFrom="margin">
             <wp:posOffset>6201104</wp:posOffset>
@@ -34103,13 +34986,13 @@
 </file>
 
 <file path=customXml/itemProps2.xml><?xml version="1.0" encoding="utf-8"?>
-<ds:datastoreItem xmlns:ds="http://schemas.openxmlformats.org/officeDocument/2006/customXml" ds:itemID="{CF69A9E4-B3E4-4DC8-B816-291EDF8E4061}"/>
+<ds:datastoreItem xmlns:ds="http://schemas.openxmlformats.org/officeDocument/2006/customXml" ds:itemID="{9BE82D56-DE9E-4B47-AD10-E9E80F851E35}"/>
 </file>
 
 <file path=customXml/itemProps3.xml><?xml version="1.0" encoding="utf-8"?>
-<ds:datastoreItem xmlns:ds="http://schemas.openxmlformats.org/officeDocument/2006/customXml" ds:itemID="{F8FC5104-F064-4641-B2CD-DA2BE408F22C}"/>
+<ds:datastoreItem xmlns:ds="http://schemas.openxmlformats.org/officeDocument/2006/customXml" ds:itemID="{EB914592-BC2A-4E60-8186-3D27C5FD5B24}"/>
 </file>
 
 <file path=customXml/itemProps4.xml><?xml version="1.0" encoding="utf-8"?>
-<ds:datastoreItem xmlns:ds="http://schemas.openxmlformats.org/officeDocument/2006/customXml" ds:itemID="{A517DFD1-1585-4C9B-A3C3-8AF0213C6AFC}"/>
+<ds:datastoreItem xmlns:ds="http://schemas.openxmlformats.org/officeDocument/2006/customXml" ds:itemID="{E58EA4E1-277B-45BA-916D-3392CF31483E}"/>
 </file>
</xml_diff>

<commit_message>
Actualización anexos y DU
</commit_message>
<xml_diff>
--- a/fuentes/123101_CF07_DU.docx
+++ b/fuentes/123101_CF07_DU.docx
@@ -519,7 +519,7 @@
           <w:r>
             <w:fldChar w:fldCharType="separate"/>
           </w:r>
-          <w:hyperlink w:anchor="_Toc197627333" w:history="1">
+          <w:hyperlink w:anchor="_Toc198372984" w:history="1">
             <w:r>
               <w:rPr>
                 <w:rStyle w:val="Hipervnculo"/>
@@ -546,7 +546,7 @@
                 <w:noProof/>
                 <w:webHidden/>
               </w:rPr>
-              <w:instrText xml:space="preserve"> PAGEREF _Toc197627333 \h </w:instrText>
+              <w:instrText xml:space="preserve"> PAGEREF _Toc198372984 \h </w:instrText>
             </w:r>
             <w:r>
               <w:rPr>
@@ -592,7 +592,7 @@
               <w:lang w:eastAsia="es-CO"/>
             </w:rPr>
           </w:pPr>
-          <w:hyperlink w:anchor="_Toc197627334" w:history="1">
+          <w:hyperlink w:anchor="_Toc198372985" w:history="1">
             <w:r>
               <w:rPr>
                 <w:rStyle w:val="Hipervnculo"/>
@@ -636,7 +636,7 @@
                 <w:noProof/>
                 <w:webHidden/>
               </w:rPr>
-              <w:instrText xml:space="preserve"> PAGEREF _Toc197627334 \h </w:instrText>
+              <w:instrText xml:space="preserve"> PAGEREF _Toc198372985 \h </w:instrText>
             </w:r>
             <w:r>
               <w:rPr>
@@ -682,7 +682,7 @@
               <w:lang w:eastAsia="es-CO"/>
             </w:rPr>
           </w:pPr>
-          <w:hyperlink w:anchor="_Toc197627335" w:history="1">
+          <w:hyperlink w:anchor="_Toc198372986" w:history="1">
             <w:r>
               <w:rPr>
                 <w:rStyle w:val="Hipervnculo"/>
@@ -732,7 +732,7 @@
                 <w:noProof/>
                 <w:webHidden/>
               </w:rPr>
-              <w:instrText xml:space="preserve"> PAGEREF _Toc197627335 \h </w:instrText>
+              <w:instrText xml:space="preserve"> PAGEREF _Toc198372986 \h </w:instrText>
             </w:r>
             <w:r>
               <w:rPr>
@@ -778,7 +778,7 @@
               <w:lang w:eastAsia="es-CO"/>
             </w:rPr>
           </w:pPr>
-          <w:hyperlink w:anchor="_Toc197627336" w:history="1">
+          <w:hyperlink w:anchor="_Toc198372987" w:history="1">
             <w:r>
               <w:rPr>
                 <w:rStyle w:val="Hipervnculo"/>
@@ -828,7 +828,7 @@
                 <w:noProof/>
                 <w:webHidden/>
               </w:rPr>
-              <w:instrText xml:space="preserve"> PAGEREF _Toc197627336 \h </w:instrText>
+              <w:instrText xml:space="preserve"> PAGEREF _Toc198372987 \h </w:instrText>
             </w:r>
             <w:r>
               <w:rPr>
@@ -874,7 +874,7 @@
               <w:lang w:eastAsia="es-CO"/>
             </w:rPr>
           </w:pPr>
-          <w:hyperlink w:anchor="_Toc197627337" w:history="1">
+          <w:hyperlink w:anchor="_Toc198372988" w:history="1">
             <w:r>
               <w:rPr>
                 <w:rStyle w:val="Hipervnculo"/>
@@ -924,7 +924,7 @@
                 <w:noProof/>
                 <w:webHidden/>
               </w:rPr>
-              <w:instrText xml:space="preserve"> PAGEREF _Toc197627337 \h </w:instrText>
+              <w:instrText xml:space="preserve"> PAGEREF _Toc198372988 \h </w:instrText>
             </w:r>
             <w:r>
               <w:rPr>
@@ -970,7 +970,7 @@
               <w:lang w:eastAsia="es-CO"/>
             </w:rPr>
           </w:pPr>
-          <w:hyperlink w:anchor="_Toc197627338" w:history="1">
+          <w:hyperlink w:anchor="_Toc198372989" w:history="1">
             <w:r>
               <w:rPr>
                 <w:rStyle w:val="Hipervnculo"/>
@@ -1020,7 +1020,7 @@
                 <w:noProof/>
                 <w:webHidden/>
               </w:rPr>
-              <w:instrText xml:space="preserve"> PAGEREF _Toc197627338 \h </w:instrText>
+              <w:instrText xml:space="preserve"> PAGEREF _Toc198372989 \h </w:instrText>
             </w:r>
             <w:r>
               <w:rPr>
@@ -1066,7 +1066,7 @@
               <w:lang w:eastAsia="es-CO"/>
             </w:rPr>
           </w:pPr>
-          <w:hyperlink w:anchor="_Toc197627339" w:history="1">
+          <w:hyperlink w:anchor="_Toc198372990" w:history="1">
             <w:r>
               <w:rPr>
                 <w:rStyle w:val="Hipervnculo"/>
@@ -1116,7 +1116,7 @@
                 <w:noProof/>
                 <w:webHidden/>
               </w:rPr>
-              <w:instrText xml:space="preserve"> PAGEREF _Toc197627339 \h </w:instrText>
+              <w:instrText xml:space="preserve"> PAGEREF _Toc198372990 \h </w:instrText>
             </w:r>
             <w:r>
               <w:rPr>
@@ -1162,7 +1162,7 @@
               <w:lang w:eastAsia="es-CO"/>
             </w:rPr>
           </w:pPr>
-          <w:hyperlink w:anchor="_Toc197627340" w:history="1">
+          <w:hyperlink w:anchor="_Toc198372991" w:history="1">
             <w:r>
               <w:rPr>
                 <w:rStyle w:val="Hipervnculo"/>
@@ -1212,7 +1212,7 @@
                 <w:noProof/>
                 <w:webHidden/>
               </w:rPr>
-              <w:instrText xml:space="preserve"> PAGEREF _Toc197627340 \h </w:instrText>
+              <w:instrText xml:space="preserve"> PAGEREF _Toc198372991 \h </w:instrText>
             </w:r>
             <w:r>
               <w:rPr>
@@ -1258,7 +1258,7 @@
               <w:lang w:eastAsia="es-CO"/>
             </w:rPr>
           </w:pPr>
-          <w:hyperlink w:anchor="_Toc197627341" w:history="1">
+          <w:hyperlink w:anchor="_Toc198372992" w:history="1">
             <w:r>
               <w:rPr>
                 <w:rStyle w:val="Hipervnculo"/>
@@ -1308,7 +1308,7 @@
                 <w:noProof/>
                 <w:webHidden/>
               </w:rPr>
-              <w:instrText xml:space="preserve"> PAGEREF _Toc197627341 \h </w:instrText>
+              <w:instrText xml:space="preserve"> PAGEREF _Toc198372992 \h </w:instrText>
             </w:r>
             <w:r>
               <w:rPr>
@@ -1354,7 +1354,7 @@
               <w:lang w:eastAsia="es-CO"/>
             </w:rPr>
           </w:pPr>
-          <w:hyperlink w:anchor="_Toc197627342" w:history="1">
+          <w:hyperlink w:anchor="_Toc198372993" w:history="1">
             <w:r>
               <w:rPr>
                 <w:rStyle w:val="Hipervnculo"/>
@@ -1398,7 +1398,7 @@
                 <w:noProof/>
                 <w:webHidden/>
               </w:rPr>
-              <w:instrText xml:space="preserve"> PAGEREF _Toc197627342 \h </w:instrText>
+              <w:instrText xml:space="preserve"> PAGEREF _Toc198372993 \h </w:instrText>
             </w:r>
             <w:r>
               <w:rPr>
@@ -1444,7 +1444,7 @@
               <w:lang w:eastAsia="es-CO"/>
             </w:rPr>
           </w:pPr>
-          <w:hyperlink w:anchor="_Toc197627343" w:history="1">
+          <w:hyperlink w:anchor="_Toc198372994" w:history="1">
             <w:r>
               <w:rPr>
                 <w:rStyle w:val="Hipervnculo"/>
@@ -1494,7 +1494,7 @@
                 <w:noProof/>
                 <w:webHidden/>
               </w:rPr>
-              <w:instrText xml:space="preserve"> PAGEREF _Toc197627343 \h </w:instrText>
+              <w:instrText xml:space="preserve"> PAGEREF _Toc198372994 \h </w:instrText>
             </w:r>
             <w:r>
               <w:rPr>
@@ -1540,7 +1540,7 @@
               <w:lang w:eastAsia="es-CO"/>
             </w:rPr>
           </w:pPr>
-          <w:hyperlink w:anchor="_Toc197627344" w:history="1">
+          <w:hyperlink w:anchor="_Toc198372995" w:history="1">
             <w:r>
               <w:rPr>
                 <w:rStyle w:val="Hipervnculo"/>
@@ -1590,7 +1590,7 @@
                 <w:noProof/>
                 <w:webHidden/>
               </w:rPr>
-              <w:instrText xml:space="preserve"> PAGEREF _Toc197627344 \h </w:instrText>
+              <w:instrText xml:space="preserve"> PAGEREF _Toc198372995 \h </w:instrText>
             </w:r>
             <w:r>
               <w:rPr>
@@ -1636,7 +1636,7 @@
               <w:lang w:eastAsia="es-CO"/>
             </w:rPr>
           </w:pPr>
-          <w:hyperlink w:anchor="_Toc197627345" w:history="1">
+          <w:hyperlink w:anchor="_Toc198372996" w:history="1">
             <w:r>
               <w:rPr>
                 <w:rStyle w:val="Hipervnculo"/>
@@ -1686,7 +1686,7 @@
                 <w:noProof/>
                 <w:webHidden/>
               </w:rPr>
-              <w:instrText xml:space="preserve"> PAGEREF _Toc197627345 \h </w:instrText>
+              <w:instrText xml:space="preserve"> PAGEREF _Toc198372996 \h </w:instrText>
             </w:r>
             <w:r>
               <w:rPr>
@@ -1732,7 +1732,7 @@
               <w:lang w:eastAsia="es-CO"/>
             </w:rPr>
           </w:pPr>
-          <w:hyperlink w:anchor="_Toc197627346" w:history="1">
+          <w:hyperlink w:anchor="_Toc198372997" w:history="1">
             <w:r>
               <w:rPr>
                 <w:rStyle w:val="Hipervnculo"/>
@@ -1782,7 +1782,7 @@
                 <w:noProof/>
                 <w:webHidden/>
               </w:rPr>
-              <w:instrText xml:space="preserve"> PAGEREF _Toc197627346 \h </w:instrText>
+              <w:instrText xml:space="preserve"> PAGEREF _Toc198372997 \h </w:instrText>
             </w:r>
             <w:r>
               <w:rPr>
@@ -1828,7 +1828,7 @@
               <w:lang w:eastAsia="es-CO"/>
             </w:rPr>
           </w:pPr>
-          <w:hyperlink w:anchor="_Toc197627347" w:history="1">
+          <w:hyperlink w:anchor="_Toc198372998" w:history="1">
             <w:r>
               <w:rPr>
                 <w:rStyle w:val="Hipervnculo"/>
@@ -1878,7 +1878,7 @@
                 <w:noProof/>
                 <w:webHidden/>
               </w:rPr>
-              <w:instrText xml:space="preserve"> PAGEREF _Toc197627347 \h </w:instrText>
+              <w:instrText xml:space="preserve"> PAGEREF _Toc198372998 \h </w:instrText>
             </w:r>
             <w:r>
               <w:rPr>
@@ -1923,7 +1923,7 @@
               <w:lang w:eastAsia="es-CO"/>
             </w:rPr>
           </w:pPr>
-          <w:hyperlink w:anchor="_Toc197627348" w:history="1">
+          <w:hyperlink w:anchor="_Toc198372999" w:history="1">
             <w:r>
               <w:rPr>
                 <w:rStyle w:val="Hipervnculo"/>
@@ -1950,7 +1950,7 @@
                 <w:noProof/>
                 <w:webHidden/>
               </w:rPr>
-              <w:instrText xml:space="preserve"> PAGEREF _Toc197627348 \h </w:instrText>
+              <w:instrText xml:space="preserve"> PAGEREF _Toc198372999 \h </w:instrText>
             </w:r>
             <w:r>
               <w:rPr>
@@ -1970,7 +1970,7 @@
                 <w:noProof/>
                 <w:webHidden/>
               </w:rPr>
-              <w:t>34</w:t>
+              <w:t>35</w:t>
             </w:r>
             <w:r>
               <w:rPr>
@@ -1995,7 +1995,7 @@
               <w:lang w:eastAsia="es-CO"/>
             </w:rPr>
           </w:pPr>
-          <w:hyperlink w:anchor="_Toc197627349" w:history="1">
+          <w:hyperlink w:anchor="_Toc198373000" w:history="1">
             <w:r>
               <w:rPr>
                 <w:rStyle w:val="Hipervnculo"/>
@@ -2022,7 +2022,7 @@
                 <w:noProof/>
                 <w:webHidden/>
               </w:rPr>
-              <w:instrText xml:space="preserve"> PAGEREF _Toc197627349 \h </w:instrText>
+              <w:instrText xml:space="preserve"> PAGEREF _Toc198373000 \h </w:instrText>
             </w:r>
             <w:r>
               <w:rPr>
@@ -2042,7 +2042,7 @@
                 <w:noProof/>
                 <w:webHidden/>
               </w:rPr>
-              <w:t>35</w:t>
+              <w:t>36</w:t>
             </w:r>
             <w:r>
               <w:rPr>
@@ -2067,7 +2067,7 @@
               <w:lang w:eastAsia="es-CO"/>
             </w:rPr>
           </w:pPr>
-          <w:hyperlink w:anchor="_Toc197627350" w:history="1">
+          <w:hyperlink w:anchor="_Toc198373001" w:history="1">
             <w:r>
               <w:rPr>
                 <w:rStyle w:val="Hipervnculo"/>
@@ -2094,7 +2094,7 @@
                 <w:noProof/>
                 <w:webHidden/>
               </w:rPr>
-              <w:instrText xml:space="preserve"> PAGEREF _Toc197627350 \h </w:instrText>
+              <w:instrText xml:space="preserve"> PAGEREF _Toc198373001 \h </w:instrText>
             </w:r>
             <w:r>
               <w:rPr>
@@ -2114,7 +2114,7 @@
                 <w:noProof/>
                 <w:webHidden/>
               </w:rPr>
-              <w:t>36</w:t>
+              <w:t>37</w:t>
             </w:r>
             <w:r>
               <w:rPr>
@@ -2139,7 +2139,7 @@
               <w:lang w:eastAsia="es-CO"/>
             </w:rPr>
           </w:pPr>
-          <w:hyperlink w:anchor="_Toc197627351" w:history="1">
+          <w:hyperlink w:anchor="_Toc198373002" w:history="1">
             <w:r>
               <w:rPr>
                 <w:rStyle w:val="Hipervnculo"/>
@@ -2166,7 +2166,7 @@
                 <w:noProof/>
                 <w:webHidden/>
               </w:rPr>
-              <w:instrText xml:space="preserve"> PAGEREF _Toc197627351 \h </w:instrText>
+              <w:instrText xml:space="preserve"> PAGEREF _Toc198373002 \h </w:instrText>
             </w:r>
             <w:r>
               <w:rPr>
@@ -2186,7 +2186,7 @@
                 <w:noProof/>
                 <w:webHidden/>
               </w:rPr>
-              <w:t>38</w:t>
+              <w:t>39</w:t>
             </w:r>
             <w:r>
               <w:rPr>
@@ -2211,7 +2211,7 @@
               <w:lang w:eastAsia="es-CO"/>
             </w:rPr>
           </w:pPr>
-          <w:hyperlink w:anchor="_Toc197627352" w:history="1">
+          <w:hyperlink w:anchor="_Toc198373003" w:history="1">
             <w:r>
               <w:rPr>
                 <w:rStyle w:val="Hipervnculo"/>
@@ -2238,7 +2238,7 @@
                 <w:noProof/>
                 <w:webHidden/>
               </w:rPr>
-              <w:instrText xml:space="preserve"> PAGEREF _Toc197627352 \h </w:instrText>
+              <w:instrText xml:space="preserve"> PAGEREF _Toc198373003 \h </w:instrText>
             </w:r>
             <w:r>
               <w:rPr>
@@ -2258,7 +2258,7 @@
                 <w:noProof/>
                 <w:webHidden/>
               </w:rPr>
-              <w:t>39</w:t>
+              <w:t>40</w:t>
             </w:r>
             <w:r>
               <w:rPr>
@@ -2280,7 +2280,7 @@
       <w:pPr>
         <w:pStyle w:val="Titulosgenerales"/>
       </w:pPr>
-      <w:bookmarkStart w:id="0" w:name="_Toc197627333"/>
+      <w:bookmarkStart w:id="0" w:name="_Toc198372984"/>
       <w:r>
         <w:lastRenderedPageBreak/>
         <w:t>Introducción</w:t>
@@ -2318,7 +2318,7 @@
           <w:lang w:val="es-CO"/>
         </w:rPr>
       </w:pPr>
-      <w:bookmarkStart w:id="1" w:name="_Toc197627334"/>
+      <w:bookmarkStart w:id="1" w:name="_Toc198372985"/>
       <w:r>
         <w:rPr>
           <w:lang w:val="es-CO"/>
@@ -2441,7 +2441,7 @@
       <w:pPr>
         <w:pStyle w:val="Ttulo2"/>
       </w:pPr>
-      <w:bookmarkStart w:id="2" w:name="_Toc197627335"/>
+      <w:bookmarkStart w:id="2" w:name="_Toc198372986"/>
       <w:r>
         <w:t>Política contable</w:t>
       </w:r>
@@ -2468,10 +2468,18 @@
       </w:pPr>
       <w:r>
         <w:rPr>
+          <w:b/>
+          <w:bCs/>
           <w:lang w:val="es-419" w:eastAsia="es-CO"/>
         </w:rPr>
         <w:lastRenderedPageBreak/>
-        <w:t>Una política contable debe contener:</w:t>
+        <w:t>Una política contable debe contener</w:t>
+      </w:r>
+      <w:r>
+        <w:rPr>
+          <w:lang w:val="es-419" w:eastAsia="es-CO"/>
+        </w:rPr>
+        <w:t>:</w:t>
       </w:r>
     </w:p>
     <w:p>
@@ -2655,7 +2663,31 @@
         <w:rPr>
           <w:lang w:val="es-419" w:eastAsia="es-CO"/>
         </w:rPr>
-        <w:t>Lo previsto en la Sección 11 y Sección 12 si pertenece al grupo número dos pymes.</w:t>
+        <w:t xml:space="preserve">Lo previsto en la </w:t>
+      </w:r>
+      <w:r>
+        <w:rPr>
+          <w:lang w:val="es-419" w:eastAsia="es-CO"/>
+        </w:rPr>
+        <w:t>s</w:t>
+      </w:r>
+      <w:r>
+        <w:rPr>
+          <w:lang w:val="es-419" w:eastAsia="es-CO"/>
+        </w:rPr>
+        <w:t xml:space="preserve">ección 11 y </w:t>
+      </w:r>
+      <w:r>
+        <w:rPr>
+          <w:lang w:val="es-419" w:eastAsia="es-CO"/>
+        </w:rPr>
+        <w:t>s</w:t>
+      </w:r>
+      <w:r>
+        <w:rPr>
+          <w:lang w:val="es-419" w:eastAsia="es-CO"/>
+        </w:rPr>
+        <w:t>ección 12 si pertenece al grupo número dos pymes.</w:t>
       </w:r>
     </w:p>
     <w:p>
@@ -2694,7 +2726,7 @@
       <w:pPr>
         <w:pStyle w:val="Ttulo2"/>
       </w:pPr>
-      <w:bookmarkStart w:id="3" w:name="_Toc197627336"/>
+      <w:bookmarkStart w:id="3" w:name="_Toc198372987"/>
       <w:r>
         <w:t>Instrumentos financieros</w:t>
       </w:r>
@@ -3058,6 +3090,8 @@
       </w:pPr>
       <w:r>
         <w:rPr>
+          <w:b/>
+          <w:bCs/>
           <w:lang w:val="es-419" w:eastAsia="es-CO"/>
         </w:rPr>
         <w:t>Al fin del año 1 reconocimiento posterior del componente financiero</w:t>
@@ -3309,6 +3343,8 @@
       </w:pPr>
       <w:r>
         <w:rPr>
+          <w:b/>
+          <w:bCs/>
           <w:lang w:val="es-419" w:eastAsia="es-CO"/>
         </w:rPr>
         <w:lastRenderedPageBreak/>
@@ -3570,6 +3606,8 @@
       </w:pPr>
       <w:r>
         <w:rPr>
+          <w:b/>
+          <w:bCs/>
           <w:lang w:val="es-419" w:eastAsia="es-CO"/>
         </w:rPr>
         <w:t>Por reclasificar el crédito del largo al corto plazo</w:t>
@@ -3836,9 +3874,17 @@
       </w:pPr>
       <w:r>
         <w:rPr>
+          <w:b/>
+          <w:bCs/>
           <w:lang w:eastAsia="es-CO"/>
         </w:rPr>
-        <w:t>Reconocimiento por cobro de crédito.</w:t>
+        <w:t>Reconocimiento por cobro de crédito</w:t>
+      </w:r>
+      <w:r>
+        <w:rPr>
+          <w:lang w:eastAsia="es-CO"/>
+        </w:rPr>
+        <w:t>.</w:t>
       </w:r>
     </w:p>
     <w:p>
@@ -4336,7 +4382,7 @@
       <w:pPr>
         <w:pStyle w:val="Ttulo2"/>
       </w:pPr>
-      <w:bookmarkStart w:id="4" w:name="_Toc197627337"/>
+      <w:bookmarkStart w:id="4" w:name="_Toc198372988"/>
       <w:r>
         <w:t>Obligaciones con terceros</w:t>
       </w:r>
@@ -5287,7 +5333,7 @@
       <w:pPr>
         <w:pStyle w:val="Ttulo2"/>
       </w:pPr>
-      <w:bookmarkStart w:id="5" w:name="_Toc197627338"/>
+      <w:bookmarkStart w:id="5" w:name="_Toc198372989"/>
       <w:r>
         <w:t>Pasivos contingentes</w:t>
       </w:r>
@@ -5319,7 +5365,7 @@
           <w:bCs/>
           <w:lang w:val="es-CO"/>
         </w:rPr>
-        <w:t>Provisiones:</w:t>
+        <w:t>Provisiones</w:t>
       </w:r>
     </w:p>
     <w:p>
@@ -5397,7 +5443,7 @@
       <w:pPr>
         <w:pStyle w:val="Ttulo2"/>
       </w:pPr>
-      <w:bookmarkStart w:id="6" w:name="_Toc197627339"/>
+      <w:bookmarkStart w:id="6" w:name="_Toc198372990"/>
       <w:r>
         <w:t>Diferencia entre pasivo financiero e instrumento de patrimonio</w:t>
       </w:r>
@@ -5446,7 +5492,7 @@
       <w:pPr>
         <w:pStyle w:val="Ttulo2"/>
       </w:pPr>
-      <w:bookmarkStart w:id="7" w:name="_Toc197627340"/>
+      <w:bookmarkStart w:id="7" w:name="_Toc198372991"/>
       <w:r>
         <w:t>Instrumentos financieros pasivos y activos</w:t>
       </w:r>
@@ -6075,9 +6121,17 @@
       </w:pPr>
       <w:r>
         <w:rPr>
-          <w:lang w:val="es-419" w:eastAsia="es-CO"/>
-        </w:rPr>
-        <w:t>Se requiere:</w:t>
+          <w:b/>
+          <w:bCs/>
+          <w:lang w:val="es-419" w:eastAsia="es-CO"/>
+        </w:rPr>
+        <w:t>Se requiere</w:t>
+      </w:r>
+      <w:r>
+        <w:rPr>
+          <w:lang w:val="es-419" w:eastAsia="es-CO"/>
+        </w:rPr>
+        <w:t>:</w:t>
       </w:r>
     </w:p>
     <w:p>
@@ -8187,7 +8241,7 @@
       <w:pPr>
         <w:pStyle w:val="Ttulo2"/>
       </w:pPr>
-      <w:bookmarkStart w:id="8" w:name="_Toc197627341"/>
+      <w:bookmarkStart w:id="8" w:name="_Toc198372992"/>
       <w:r>
         <w:t>Reconocimiento, medición, presentación, revelación</w:t>
       </w:r>
@@ -8307,18 +8361,27 @@
         </w:rPr>
         <w:t xml:space="preserve"> </w:t>
       </w:r>
-      <w:r>
-        <w:rPr>
-          <w:lang w:val="es-419" w:eastAsia="es-CO"/>
-        </w:rPr>
-        <w:t xml:space="preserve">La medición se efectúa de acuerdo con el modelo de negocio del suscriptor. A valor razonable con cambios en el resultado del </w:t>
+    </w:p>
+    <w:p>
+      <w:pPr>
+        <w:pStyle w:val="Prrafodelista"/>
+        <w:ind w:left="1429" w:firstLine="0"/>
+        <w:rPr>
+          <w:lang w:val="es-419" w:eastAsia="es-CO"/>
+        </w:rPr>
+      </w:pPr>
+      <w:r>
+        <w:rPr>
+          <w:lang w:val="es-419" w:eastAsia="es-CO"/>
+        </w:rPr>
+        <w:t xml:space="preserve">La medición se efectúa de acuerdo con el modelo de negocio del suscriptor. A valor razonable con cambios en el resultado del ejercicio, a </w:t>
       </w:r>
       <w:r>
         <w:rPr>
           <w:lang w:val="es-419" w:eastAsia="es-CO"/>
         </w:rPr>
         <w:lastRenderedPageBreak/>
-        <w:t>ejercicio, a costo amortizado con el interés efectivo y a valor razonable con cambios en el patrimonio de la sociedad.</w:t>
+        <w:t>costo amortizado con el interés efectivo y a valor razonable con cambios en el patrimonio de la sociedad.</w:t>
       </w:r>
     </w:p>
     <w:p>
@@ -8442,6 +8505,25 @@
           <w:lang w:val="es-419" w:eastAsia="es-CO"/>
         </w:rPr>
         <w:t>Amortización contractual</w:t>
+      </w:r>
+    </w:p>
+    <w:p>
+      <w:pPr>
+        <w:rPr>
+          <w:lang w:val="es-419" w:eastAsia="es-CO"/>
+        </w:rPr>
+      </w:pPr>
+      <w:r>
+        <w:rPr>
+          <w:lang w:val="es-419" w:eastAsia="es-CO"/>
+        </w:rPr>
+        <w:t>P</w:t>
+      </w:r>
+      <w:r>
+        <w:rPr>
+          <w:lang w:val="es-419" w:eastAsia="es-CO"/>
+        </w:rPr>
+        <w:t>ara el reconocimiento de los abonos a capital e intereses incluidos en cada cuota por pagar.</w:t>
       </w:r>
     </w:p>
     <w:tbl>
@@ -8685,6 +8767,7 @@
               <w:jc w:val="center"/>
             </w:pPr>
             <w:r>
+              <w:lastRenderedPageBreak/>
               <w:t>2</w:t>
             </w:r>
           </w:p>
@@ -8860,7 +8943,6 @@
               <w:jc w:val="center"/>
             </w:pPr>
             <w:r>
-              <w:lastRenderedPageBreak/>
               <w:t>4</w:t>
             </w:r>
           </w:p>
@@ -9312,23 +9394,9 @@
     </w:p>
     <w:p>
       <w:pPr>
-        <w:rPr>
-          <w:lang w:val="es-419" w:eastAsia="es-CO"/>
-        </w:rPr>
-      </w:pPr>
-    </w:p>
-    <w:p>
-      <w:pPr>
-        <w:rPr>
-          <w:lang w:val="es-419" w:eastAsia="es-CO"/>
-        </w:rPr>
-      </w:pPr>
-    </w:p>
-    <w:p>
-      <w:pPr>
         <w:pStyle w:val="Ttulo1"/>
       </w:pPr>
-      <w:bookmarkStart w:id="9" w:name="_Toc197627342"/>
+      <w:bookmarkStart w:id="9" w:name="_Toc198372993"/>
       <w:r>
         <w:lastRenderedPageBreak/>
         <w:t>Instrumentos de patrimonio</w:t>
@@ -9391,7 +9459,7 @@
       <w:pPr>
         <w:pStyle w:val="Ttulo2"/>
       </w:pPr>
-      <w:bookmarkStart w:id="10" w:name="_Toc197627343"/>
+      <w:bookmarkStart w:id="10" w:name="_Toc198372994"/>
       <w:r>
         <w:t>Reconocimiento, medición, presentación, revelación</w:t>
       </w:r>
@@ -10457,7 +10525,7 @@
       <w:pPr>
         <w:pStyle w:val="Ttulo2"/>
       </w:pPr>
-      <w:bookmarkStart w:id="11" w:name="_Toc197627344"/>
+      <w:bookmarkStart w:id="11" w:name="_Toc198372995"/>
       <w:r>
         <w:t>Aportes de capital</w:t>
       </w:r>
@@ -11352,11 +11420,6 @@
           <w:lang w:val="es-419" w:eastAsia="es-CO"/>
         </w:rPr>
         <w:tab/>
-      </w:r>
-      <w:r>
-        <w:rPr>
-          <w:lang w:val="es-419" w:eastAsia="es-CO"/>
-        </w:rPr>
         <w:t xml:space="preserve">                                      </w:t>
       </w:r>
       <w:r>
@@ -11364,11 +11427,6 @@
           <w:lang w:val="es-419" w:eastAsia="es-CO"/>
         </w:rPr>
         <w:tab/>
-      </w:r>
-      <w:r>
-        <w:rPr>
-          <w:lang w:val="es-419" w:eastAsia="es-CO"/>
-        </w:rPr>
         <w:t xml:space="preserve">        150.000.000</w:t>
       </w:r>
     </w:p>
@@ -11983,13 +12041,7 @@
           <w:lang w:val="es-419" w:eastAsia="es-CO"/>
         </w:rPr>
         <w:tab/>
-        <w:t xml:space="preserve">    </w:t>
-      </w:r>
-      <w:r>
-        <w:rPr>
-          <w:lang w:val="es-419" w:eastAsia="es-CO"/>
-        </w:rPr>
-        <w:t>$0</w:t>
+        <w:t xml:space="preserve">    $0</w:t>
       </w:r>
     </w:p>
     <w:p>
@@ -12085,19 +12137,7 @@
           <w:lang w:val="es-419" w:eastAsia="es-CO"/>
         </w:rPr>
         <w:tab/>
-        <w:t xml:space="preserve">      $</w:t>
-      </w:r>
-      <w:r>
-        <w:rPr>
-          <w:lang w:val="es-419" w:eastAsia="es-CO"/>
-        </w:rPr>
-        <w:t>300</w:t>
-      </w:r>
-      <w:r>
-        <w:rPr>
-          <w:lang w:val="es-419" w:eastAsia="es-CO"/>
-        </w:rPr>
-        <w:t>.000.000</w:t>
+        <w:t xml:space="preserve">      $300.000.000</w:t>
       </w:r>
     </w:p>
     <w:p>
@@ -12144,49 +12184,7 @@
           <w:lang w:val="es-419" w:eastAsia="es-CO"/>
         </w:rPr>
         <w:tab/>
-        <w:t xml:space="preserve">   </w:t>
-      </w:r>
-      <w:r>
-        <w:rPr>
-          <w:lang w:val="es-419" w:eastAsia="es-CO"/>
-        </w:rPr>
-        <w:t xml:space="preserve"> </w:t>
-      </w:r>
-      <w:r>
-        <w:rPr>
-          <w:lang w:val="es-419" w:eastAsia="es-CO"/>
-        </w:rPr>
-        <w:t>$</w:t>
-      </w:r>
-      <w:r>
-        <w:rPr>
-          <w:lang w:val="es-419" w:eastAsia="es-CO"/>
-        </w:rPr>
-        <w:t>(</w:t>
-      </w:r>
-      <w:r>
-        <w:rPr>
-          <w:lang w:val="es-419" w:eastAsia="es-CO"/>
-        </w:rPr>
-        <w:t>15</w:t>
-      </w:r>
-      <w:r>
-        <w:rPr>
-          <w:lang w:val="es-419" w:eastAsia="es-CO"/>
-        </w:rPr>
-        <w:t>0</w:t>
-      </w:r>
-      <w:r>
-        <w:rPr>
-          <w:lang w:val="es-419" w:eastAsia="es-CO"/>
-        </w:rPr>
-        <w:t>.000.000</w:t>
-      </w:r>
-      <w:r>
-        <w:rPr>
-          <w:lang w:val="es-419" w:eastAsia="es-CO"/>
-        </w:rPr>
-        <w:t>)</w:t>
+        <w:t xml:space="preserve">    $(150.000.000)</w:t>
       </w:r>
     </w:p>
     <w:p>
@@ -12227,25 +12225,7 @@
           <w:lang w:val="es-419" w:eastAsia="es-CO"/>
         </w:rPr>
         <w:tab/>
-        <w:t xml:space="preserve">      $</w:t>
-      </w:r>
-      <w:r>
-        <w:rPr>
-          <w:lang w:val="es-419" w:eastAsia="es-CO"/>
-        </w:rPr>
-        <w:t>(4</w:t>
-      </w:r>
-      <w:r>
-        <w:rPr>
-          <w:lang w:val="es-419" w:eastAsia="es-CO"/>
-        </w:rPr>
-        <w:t>5.000.000</w:t>
-      </w:r>
-      <w:r>
-        <w:rPr>
-          <w:lang w:val="es-419" w:eastAsia="es-CO"/>
-        </w:rPr>
-        <w:t>)</w:t>
+        <w:t xml:space="preserve">      $(45.000.000)</w:t>
       </w:r>
     </w:p>
     <w:p>
@@ -12354,7 +12334,7 @@
       <w:pPr>
         <w:pStyle w:val="Ttulo2"/>
       </w:pPr>
-      <w:bookmarkStart w:id="12" w:name="_Toc197627345"/>
+      <w:bookmarkStart w:id="12" w:name="_Toc198372996"/>
       <w:r>
         <w:lastRenderedPageBreak/>
         <w:t>Ganancias acumuladas</w:t>
@@ -12391,7 +12371,7 @@
       <w:pPr>
         <w:pStyle w:val="Ttulo2"/>
       </w:pPr>
-      <w:bookmarkStart w:id="13" w:name="_Toc197627346"/>
+      <w:bookmarkStart w:id="13" w:name="_Toc198372997"/>
       <w:r>
         <w:t>Reservas</w:t>
       </w:r>
@@ -12407,7 +12387,19 @@
         <w:rPr>
           <w:lang w:val="es-419" w:eastAsia="es-CO"/>
         </w:rPr>
-        <w:t>Están contempladas en los artículos 452, 453 y 454 del Código del comercio, sección II reparto de utilidades.</w:t>
+        <w:t xml:space="preserve">Están contempladas en los artículos 452, 453 y 454 del Código del </w:t>
+      </w:r>
+      <w:r>
+        <w:rPr>
+          <w:lang w:val="es-419" w:eastAsia="es-CO"/>
+        </w:rPr>
+        <w:t>C</w:t>
+      </w:r>
+      <w:r>
+        <w:rPr>
+          <w:lang w:val="es-419" w:eastAsia="es-CO"/>
+        </w:rPr>
+        <w:t>omercio, sección II reparto de utilidades.</w:t>
       </w:r>
     </w:p>
     <w:p>
@@ -12539,12 +12531,6 @@
         </w:rPr>
         <w:t xml:space="preserve"> </w:t>
       </w:r>
-      <w:r>
-        <w:rPr>
-          <w:lang w:eastAsia="es-CO"/>
-        </w:rPr>
-        <w:t>La reserva legal es un ahorro que las empresas por mandato legal en Colombia están obligadas a utilizar con el fin de proteger el capital y preservar las empresas en el futuro evitando disolverse o liquidarse por la disminución de su patrimonio. Las sociedades limitadas, las anónimas, las en comandita por acciones y las extranjeras. Deben hacer uso de la figura reserva legal. En el primer año, no se efectúan reservas; es decir, no aplica el 10 % sobre las utilidades.</w:t>
-      </w:r>
     </w:p>
     <w:p>
       <w:pPr>
@@ -12556,7 +12542,32 @@
         <w:rPr>
           <w:lang w:eastAsia="es-CO"/>
         </w:rPr>
-        <w:t>Según el del Código del comercio, sección II reparto de utilidades artículo 456, las reservas se utilizan para:</w:t>
+        <w:t>La reserva legal es un ahorro que las empresas por mandato legal en Colombia están obligadas a utilizar con el fin de proteger el capital y preservar las empresas en el futuro evitando disolverse o liquidarse por la disminución de su patrimonio. Las sociedades limitadas, las anónimas, las en comandita por acciones y las extranjeras. Deben hacer uso de la figura reserva legal. En el primer año, no se efectúan reservas; es decir, no aplica el 10 % sobre las utilidades.</w:t>
+      </w:r>
+    </w:p>
+    <w:p>
+      <w:pPr>
+        <w:rPr>
+          <w:lang w:eastAsia="es-CO"/>
+        </w:rPr>
+      </w:pPr>
+      <w:r>
+        <w:rPr>
+          <w:lang w:eastAsia="es-CO"/>
+        </w:rPr>
+        <w:t xml:space="preserve">Según el del Código del </w:t>
+      </w:r>
+      <w:r>
+        <w:rPr>
+          <w:lang w:eastAsia="es-CO"/>
+        </w:rPr>
+        <w:t>C</w:t>
+      </w:r>
+      <w:r>
+        <w:rPr>
+          <w:lang w:eastAsia="es-CO"/>
+        </w:rPr>
+        <w:t>omercio, sección II reparto de utilidades artículo 456, las reservas se utilizan para:</w:t>
       </w:r>
     </w:p>
     <w:p>
@@ -12577,26 +12588,26 @@
         <w:rPr>
           <w:lang w:eastAsia="es-CO"/>
         </w:rPr>
-        <w:t>. Las pérdidas se enjugarán con las reservas que hayan sido destinadas especialmente para ese propósito y, en su defecto, con la reserva legal. Las reservas cuya finalidad fuere la de absorber determinadas pérdidas no se podrán emplear para cubrir otras distintas, salvo que así lo decida la asamblea. Si la reserva legal fuere insuficiente para enjugar el déficit de capital, se aplicarán a este fin los beneficios sociales de los ejercicios siguientes.</w:t>
+        <w:t xml:space="preserve">. Las pérdidas se enjugarán con las reservas que hayan sido destinadas especialmente para ese propósito y, en su defecto, con la reserva legal. Las reservas cuya finalidad fuere la de absorber determinadas pérdidas no se podrán emplear para cubrir otras distintas, salvo que así lo decida la asamblea. Si la </w:t>
       </w:r>
       <w:r>
         <w:rPr>
           <w:lang w:eastAsia="es-CO"/>
         </w:rPr>
+        <w:lastRenderedPageBreak/>
+        <w:t>reserva legal fuere insuficiente para enjugar el déficit de capital, se aplicarán a este fin los beneficios sociales de los ejercicios siguientes.</w:t>
+      </w:r>
+      <w:r>
+        <w:rPr>
+          <w:lang w:eastAsia="es-CO"/>
+        </w:rPr>
         <w:t xml:space="preserve"> </w:t>
       </w:r>
       <w:r>
         <w:rPr>
           <w:lang w:eastAsia="es-CO"/>
         </w:rPr>
-        <w:t xml:space="preserve">La reserva legal para las sociedades </w:t>
-      </w:r>
-      <w:r>
-        <w:rPr>
-          <w:lang w:eastAsia="es-CO"/>
-        </w:rPr>
-        <w:lastRenderedPageBreak/>
-        <w:t>de responsabilidad limitada aplicará el 10 % de reservas frente a sus utilidades acorde al libro segundo, responsabilidad limitada del Código del Comercio</w:t>
+        <w:t>La reserva legal para las sociedades de responsabilidad limitada aplicará el 10 % de reservas frente a sus utilidades acorde al libro segundo, responsabilidad limitada del Código del Comercio</w:t>
       </w:r>
       <w:r>
         <w:rPr>
@@ -12922,6 +12933,7 @@
         <w:rPr>
           <w:lang w:val="es-419" w:eastAsia="es-CO"/>
         </w:rPr>
+        <w:lastRenderedPageBreak/>
         <w:t>Frente a la utilidad se aplica el porcentaje vigente definido en cada reforma tributaria, del resultado obtenido, se aplica el 10 % de reserva legal y se resta a la utilidad líquida.</w:t>
       </w:r>
     </w:p>
@@ -12929,9 +12941,8 @@
       <w:pPr>
         <w:pStyle w:val="Ttulo2"/>
       </w:pPr>
-      <w:bookmarkStart w:id="14" w:name="_Toc197627347"/>
-      <w:r>
-        <w:lastRenderedPageBreak/>
+      <w:bookmarkStart w:id="14" w:name="_Toc198372998"/>
+      <w:r>
         <w:t>Otro resultado integral (ORI)</w:t>
       </w:r>
       <w:bookmarkEnd w:id="14"/>
@@ -13042,7 +13053,13 @@
         <w:pStyle w:val="Tabla"/>
       </w:pPr>
       <w:r>
-        <w:t>Ejemplo: Presentación ORI</w:t>
+        <w:t xml:space="preserve">Ejemplo: </w:t>
+      </w:r>
+      <w:r>
+        <w:t>p</w:t>
+      </w:r>
+      <w:r>
+        <w:t>resentación ORI</w:t>
       </w:r>
     </w:p>
     <w:tbl>
@@ -13181,6 +13198,7 @@
               <w:pStyle w:val="TextoTablas"/>
             </w:pPr>
             <w:r>
+              <w:lastRenderedPageBreak/>
               <w:t>Utilidad bruta</w:t>
             </w:r>
           </w:p>
@@ -13271,7 +13289,6 @@
               <w:pStyle w:val="TextoTablas"/>
             </w:pPr>
             <w:r>
-              <w:lastRenderedPageBreak/>
               <w:t>Impuesto renta</w:t>
             </w:r>
           </w:p>
@@ -13348,7 +13365,19 @@
         <w:rPr>
           <w:lang w:val="es-419" w:eastAsia="es-CO"/>
         </w:rPr>
-        <w:t>Ejemplo: Presentación ORI</w:t>
+        <w:t xml:space="preserve">Ejemplo: </w:t>
+      </w:r>
+      <w:r>
+        <w:rPr>
+          <w:lang w:val="es-419" w:eastAsia="es-CO"/>
+        </w:rPr>
+        <w:t>p</w:t>
+      </w:r>
+      <w:r>
+        <w:rPr>
+          <w:lang w:val="es-419" w:eastAsia="es-CO"/>
+        </w:rPr>
+        <w:t>resentación ORI</w:t>
       </w:r>
     </w:p>
     <w:tbl>
@@ -13745,7 +13774,14 @@
         <w:rPr>
           <w:lang w:eastAsia="es-CO"/>
         </w:rPr>
-        <w:t>Documento de orientación técnica 001 “Contabilidad bajo los nuevos marcos técnicos normativos”</w:t>
+        <w:t xml:space="preserve">Documento de orientación </w:t>
+      </w:r>
+      <w:r>
+        <w:rPr>
+          <w:lang w:eastAsia="es-CO"/>
+        </w:rPr>
+        <w:lastRenderedPageBreak/>
+        <w:t>técnica 001 “Contabilidad bajo los nuevos marcos técnicos normativos”</w:t>
       </w:r>
       <w:r>
         <w:rPr>
@@ -13795,7 +13831,7 @@
           <w:lang w:val="es-CO"/>
         </w:rPr>
       </w:pPr>
-      <w:bookmarkStart w:id="15" w:name="_Toc197627348"/>
+      <w:bookmarkStart w:id="15" w:name="_Toc198372999"/>
       <w:r>
         <w:rPr>
           <w:lang w:val="es-CO"/>
@@ -13907,7 +13943,7 @@
           <w:lang w:val="es-CO"/>
         </w:rPr>
       </w:pPr>
-      <w:bookmarkStart w:id="16" w:name="_Toc197627349"/>
+      <w:bookmarkStart w:id="16" w:name="_Toc198373000"/>
       <w:r>
         <w:rPr>
           <w:lang w:val="es-CO"/>
@@ -14372,7 +14408,7 @@
           <w:lang w:val="es-CO"/>
         </w:rPr>
       </w:pPr>
-      <w:bookmarkStart w:id="17" w:name="_Toc197627350"/>
+      <w:bookmarkStart w:id="17" w:name="_Toc198373001"/>
       <w:r>
         <w:rPr>
           <w:lang w:val="es-CO"/>
@@ -14480,7 +14516,7 @@
           <w:lang w:val="es-CO"/>
         </w:rPr>
       </w:pPr>
-      <w:bookmarkStart w:id="18" w:name="_Toc197627351"/>
+      <w:bookmarkStart w:id="18" w:name="_Toc198373002"/>
       <w:r>
         <w:rPr>
           <w:lang w:val="es-CO"/>
@@ -14604,7 +14640,7 @@
           <w:lang w:val="es-CO"/>
         </w:rPr>
       </w:pPr>
-      <w:bookmarkStart w:id="19" w:name="_Toc197627352"/>
+      <w:bookmarkStart w:id="19" w:name="_Toc198373003"/>
       <w:r>
         <w:rPr>
           <w:lang w:val="es-CO"/>
@@ -33551,6 +33587,7 @@
   <w:style w:type="character" w:default="1" w:styleId="Fuentedeprrafopredeter">
     <w:name w:val="Default Paragraph Font"/>
     <w:uiPriority w:val="1"/>
+    <w:semiHidden/>
     <w:unhideWhenUsed/>
   </w:style>
   <w:style w:type="table" w:default="1" w:styleId="Tablanormal">
@@ -34986,13 +35023,13 @@
 </file>
 
 <file path=customXml/itemProps2.xml><?xml version="1.0" encoding="utf-8"?>
-<ds:datastoreItem xmlns:ds="http://schemas.openxmlformats.org/officeDocument/2006/customXml" ds:itemID="{9BE82D56-DE9E-4B47-AD10-E9E80F851E35}"/>
+<ds:datastoreItem xmlns:ds="http://schemas.openxmlformats.org/officeDocument/2006/customXml" ds:itemID="{D1863B65-09C4-4A22-96E9-D3772BB5E610}"/>
 </file>
 
 <file path=customXml/itemProps3.xml><?xml version="1.0" encoding="utf-8"?>
-<ds:datastoreItem xmlns:ds="http://schemas.openxmlformats.org/officeDocument/2006/customXml" ds:itemID="{EB914592-BC2A-4E60-8186-3D27C5FD5B24}"/>
+<ds:datastoreItem xmlns:ds="http://schemas.openxmlformats.org/officeDocument/2006/customXml" ds:itemID="{E916C113-A550-45E1-9784-195560FDF33C}"/>
 </file>
 
 <file path=customXml/itemProps4.xml><?xml version="1.0" encoding="utf-8"?>
-<ds:datastoreItem xmlns:ds="http://schemas.openxmlformats.org/officeDocument/2006/customXml" ds:itemID="{E58EA4E1-277B-45BA-916D-3392CF31483E}"/>
+<ds:datastoreItem xmlns:ds="http://schemas.openxmlformats.org/officeDocument/2006/customXml" ds:itemID="{81F85B10-4B24-4881-BEEE-F44697AC64CC}"/>
 </file>
</xml_diff>